<commit_message>
KK1: säilita koolituskaardi formaat, tunni sisu tunnikavas
- Komaktne ASCII koolituskaart (eesmine leht) säilitatud
- Täielik tunni sisu integreeritud tunnikava tabelisse
- Osaleja tööleht, kuus tuuma, koolitaja märkused kaardi sees

Co-authored-by: reneealuste-commits <reneealuste-commits@users.noreply.github.com>
</commit_message>
<xml_diff>
--- a/opord/kursid/KK1-inimlik-tuum-koolituskaart.docx
+++ b/opord/kursid/KK1-inimlik-tuum-koolituskaart.docx
@@ -15,7 +15,7 @@
         <w:pStyle w:val="Subtitle"/>
       </w:pPr>
       <w:r>
-        <w:t xml:space="preserve">Koolituskaart ja tunni sisu (90 min)</w:t>
+        <w:t xml:space="preserve">Koolituskaart + tunnikava (90 min)</w:t>
       </w:r>
     </w:p>
     <w:sdt>
@@ -44,22 +44,13 @@
         </w:p>
       </w:sdtContent>
     </w:sdt>
-    <w:bookmarkStart w:id="41" w:name="koolituskaart-kk1-inimlik-tuum"/>
+    <w:bookmarkStart w:id="27" w:name="koolituskaart-kk1-inimlik-tuum"/>
     <w:p>
       <w:pPr>
         <w:pStyle w:val="Heading1"/>
       </w:pPr>
       <w:r>
         <w:t xml:space="preserve">KOOLITUSKAART KK1 — Inimlik tuum</w:t>
-      </w:r>
-    </w:p>
-    <w:bookmarkStart w:id="20" w:name="X0d0f61edc5ad3d7410dcd08b97bf884f2fa6070"/>
-    <w:p>
-      <w:pPr>
-        <w:pStyle w:val="Heading2"/>
-      </w:pPr>
-      <w:r>
-        <w:t xml:space="preserve">Turvalisus, naer, puudutus, kütmine, mäng ja looming</w:t>
       </w:r>
     </w:p>
     <w:p>
@@ -77,7 +68,7 @@
         <w:t xml:space="preserve"> </w:t>
       </w:r>
       <w:r>
-        <w:t xml:space="preserve">| Koolitaja kaart + tunni sisu |</w:t>
+        <w:t xml:space="preserve">| Koolitaja kaart |</w:t>
       </w:r>
       <w:r>
         <w:t xml:space="preserve"> </w:t>
@@ -144,7 +135,7 @@
                 <w:bCs/>
                 <w:b/>
               </w:rPr>
-              <w:t xml:space="preserve">Versioon</w:t>
+              <w:t xml:space="preserve">Teema</w:t>
             </w:r>
           </w:p>
         </w:tc>
@@ -156,7 +147,7 @@
               <w:jc w:val="left"/>
             </w:pPr>
             <w:r>
-              <w:t xml:space="preserve">1.0 · 8. august 2026</w:t>
+              <w:t xml:space="preserve">Turvalisus, naer, puudutus, kütmine, mäng, looming</w:t>
             </w:r>
           </w:p>
         </w:tc>
@@ -174,7 +165,7 @@
                 <w:bCs/>
                 <w:b/>
               </w:rPr>
-              <w:t xml:space="preserve">Koolitaja</w:t>
+              <w:t xml:space="preserve">Versioon</w:t>
             </w:r>
           </w:p>
         </w:tc>
@@ -186,7 +177,7 @@
               <w:jc w:val="left"/>
             </w:pPr>
             <w:r>
-              <w:t xml:space="preserve">Demomees (Lisa N) / juht (tee F)</w:t>
+              <w:t xml:space="preserve">1.1 · 8. august 2026</w:t>
             </w:r>
           </w:p>
         </w:tc>
@@ -204,7 +195,7 @@
                 <w:bCs/>
                 <w:b/>
               </w:rPr>
-              <w:t xml:space="preserve">Sihtgrupp</w:t>
+              <w:t xml:space="preserve">Koolitaja</w:t>
             </w:r>
           </w:p>
         </w:tc>
@@ -216,7 +207,7 @@
               <w:jc w:val="left"/>
             </w:pPr>
             <w:r>
-              <w:t xml:space="preserve">Täiskasvanud — pere, kogukond, meeskond (max 12 osalejat)</w:t>
+              <w:t xml:space="preserve">Demomees (Lisa N) / juht (tee F)</w:t>
             </w:r>
           </w:p>
         </w:tc>
@@ -234,7 +225,7 @@
                 <w:bCs/>
                 <w:b/>
               </w:rPr>
-              <w:t xml:space="preserve">Eeldused</w:t>
+              <w:t xml:space="preserve">Sihtgrupp</w:t>
             </w:r>
           </w:p>
         </w:tc>
@@ -246,7 +237,37 @@
               <w:jc w:val="left"/>
             </w:pPr>
             <w:r>
-              <w:t xml:space="preserve">Lisa P põhimõtted loetud või läbi elatud; trauma-kriisis</w:t>
+              <w:t xml:space="preserve">Täiskasvanud — pere, kogukond, meeskond (max 12)</w:t>
+            </w:r>
+          </w:p>
+        </w:tc>
+      </w:tr>
+      <w:tr>
+        <w:tc>
+          <w:tcPr/>
+          <w:p>
+            <w:pPr>
+              <w:pStyle w:val="Compact"/>
+              <w:jc w:val="left"/>
+            </w:pPr>
+            <w:r>
+              <w:rPr>
+                <w:bCs/>
+                <w:b/>
+              </w:rPr>
+              <w:t xml:space="preserve">Eeldused</w:t>
+            </w:r>
+          </w:p>
+        </w:tc>
+        <w:tc>
+          <w:tcPr/>
+          <w:p>
+            <w:pPr>
+              <w:pStyle w:val="Compact"/>
+              <w:jc w:val="left"/>
+            </w:pPr>
+            <w:r>
+              <w:t xml:space="preserve">Lisa P põhimõtted; trauma-kriisis</w:t>
             </w:r>
             <w:r>
               <w:t xml:space="preserve"> </w:t>
@@ -307,7 +328,268 @@
           <w:iCs/>
           <w:i/>
         </w:rPr>
-        <w:t xml:space="preserve">🫡 Ära usu mind. See tund ei anna sulle uut ideoloogiat. See meenutab, mis inimkeha juba teab.</w:t>
+        <w:t xml:space="preserve">🫡 Ära usu mind. See tund ei anna uut ideoloogiat. See meenutab, mis inimkeha juba teab.</w:t>
+      </w:r>
+    </w:p>
+    <w:p>
+      <w:r>
+        <w:pict>
+          <v:rect style="width:0;height:1.5pt" o:hralign="center" o:hrstd="t" o:hr="t"/>
+        </w:pict>
+      </w:r>
+    </w:p>
+    <w:bookmarkStart w:id="20" w:name="Xd242428be4b1323c2936f6bf679c046e5d478a9"/>
+    <w:p>
+      <w:pPr>
+        <w:pStyle w:val="Heading2"/>
+      </w:pPr>
+      <w:r>
+        <w:t xml:space="preserve">KOOLITUSKAART (prindi see leht — koolitaja taskus)</w:t>
+      </w:r>
+    </w:p>
+    <w:p>
+      <w:pPr>
+        <w:pStyle w:val="SourceCode"/>
+      </w:pPr>
+      <w:r>
+        <w:rPr>
+          <w:rStyle w:val="VerbatimChar"/>
+        </w:rPr>
+        <w:t xml:space="preserve">╔══════════════════════════════════════════════════════════════════╗</w:t>
+      </w:r>
+      <w:r>
+        <w:br/>
+      </w:r>
+      <w:r>
+        <w:rPr>
+          <w:rStyle w:val="VerbatimChar"/>
+        </w:rPr>
+        <w:t xml:space="preserve">║  KK1 — INIMLIK TUUM                              90 min         ║</w:t>
+      </w:r>
+      <w:r>
+        <w:br/>
+      </w:r>
+      <w:r>
+        <w:rPr>
+          <w:rStyle w:val="VerbatimChar"/>
+        </w:rPr>
+        <w:t xml:space="preserve">║  Operatsioon „Peegel" · demomees / juht                         ║</w:t>
+      </w:r>
+      <w:r>
+        <w:br/>
+      </w:r>
+      <w:r>
+        <w:rPr>
+          <w:rStyle w:val="VerbatimChar"/>
+        </w:rPr>
+        <w:t xml:space="preserve">╠══════════════════════════════════════════════════════════════════╣</w:t>
+      </w:r>
+      <w:r>
+        <w:br/>
+      </w:r>
+      <w:r>
+        <w:rPr>
+          <w:rStyle w:val="VerbatimChar"/>
+        </w:rPr>
+        <w:t xml:space="preserve">║  EESMÄRK                                                         ║</w:t>
+      </w:r>
+      <w:r>
+        <w:br/>
+      </w:r>
+      <w:r>
+        <w:rPr>
+          <w:rStyle w:val="VerbatimChar"/>
+        </w:rPr>
+        <w:t xml:space="preserve">║  Osaleja tunneb turvaliselt, nimetab 6 tuuma, kogeb vähemalt     ║</w:t>
+      </w:r>
+      <w:r>
+        <w:br/>
+      </w:r>
+      <w:r>
+        <w:rPr>
+          <w:rStyle w:val="VerbatimChar"/>
+        </w:rPr>
+        <w:t xml:space="preserve">║  kaks tuuma kehas, kirjutab ühe 90-päeva sammu.                  ║</w:t>
+      </w:r>
+      <w:r>
+        <w:br/>
+      </w:r>
+      <w:r>
+        <w:rPr>
+          <w:rStyle w:val="VerbatimChar"/>
+        </w:rPr>
+        <w:t xml:space="preserve">╠══════════════════════════════════════════════════════════════════╣</w:t>
+      </w:r>
+      <w:r>
+        <w:br/>
+      </w:r>
+      <w:r>
+        <w:rPr>
+          <w:rStyle w:val="VerbatimChar"/>
+        </w:rPr>
+        <w:t xml:space="preserve">║  VAHENDID          │  REEGLID                                    ║</w:t>
+      </w:r>
+      <w:r>
+        <w:br/>
+      </w:r>
+      <w:r>
+        <w:rPr>
+          <w:rStyle w:val="VerbatimChar"/>
+        </w:rPr>
+        <w:t xml:space="preserve">║  pliiats, paber    │  · Keha enne mõistust (Lisa P)              ║</w:t>
+      </w:r>
+      <w:r>
+        <w:br/>
+      </w:r>
+      <w:r>
+        <w:rPr>
+          <w:rStyle w:val="VerbatimChar"/>
+        </w:rPr>
+        <w:t xml:space="preserve">║  lihtne toit/tee   │  · Puudutus ainult nõusolekuga              ║</w:t>
+      </w:r>
+      <w:r>
+        <w:br/>
+      </w:r>
+      <w:r>
+        <w:rPr>
+          <w:rStyle w:val="VerbatimChar"/>
+        </w:rPr>
+        <w:t xml:space="preserve">║  timer 90 sek       │  · Trauma olekus — ruum, mitte debatt       ║</w:t>
+      </w:r>
+      <w:r>
+        <w:br/>
+      </w:r>
+      <w:r>
+        <w:rPr>
+          <w:rStyle w:val="VerbatimChar"/>
+        </w:rPr>
+        <w:t xml:space="preserve">║  (valik) joogikraan│  · Ära usu aju esimest mõtet (Lisa AW)      ║</w:t>
+      </w:r>
+      <w:r>
+        <w:br/>
+      </w:r>
+      <w:r>
+        <w:rPr>
+          <w:rStyle w:val="VerbatimChar"/>
+        </w:rPr>
+        <w:t xml:space="preserve">║  foto/QR Lisa BG   │  · V-formatsioon — juht keskel (Lisa I)       ║</w:t>
+      </w:r>
+      <w:r>
+        <w:br/>
+      </w:r>
+      <w:r>
+        <w:rPr>
+          <w:rStyle w:val="VerbatimChar"/>
+        </w:rPr>
+        <w:t xml:space="preserve">╠══════════════════════════════════════════════════════════════════╣</w:t>
+      </w:r>
+      <w:r>
+        <w:br/>
+      </w:r>
+      <w:r>
+        <w:rPr>
+          <w:rStyle w:val="VerbatimChar"/>
+        </w:rPr>
+        <w:t xml:space="preserve">║  TUNNISKEEM (kokkuvõte)                                          ║</w:t>
+      </w:r>
+      <w:r>
+        <w:br/>
+      </w:r>
+      <w:r>
+        <w:rPr>
+          <w:rStyle w:val="VerbatimChar"/>
+        </w:rPr>
+        <w:t xml:space="preserve">║  0–10  Avamine + turvalisus                                      ║</w:t>
+      </w:r>
+      <w:r>
+        <w:br/>
+      </w:r>
+      <w:r>
+        <w:rPr>
+          <w:rStyle w:val="VerbatimChar"/>
+        </w:rPr>
+        <w:t xml:space="preserve">║  10–25 Maailm vs inimene (seened, putukad, 65 imetajat)          ║</w:t>
+      </w:r>
+      <w:r>
+        <w:br/>
+      </w:r>
+      <w:r>
+        <w:rPr>
+          <w:rStyle w:val="VerbatimChar"/>
+        </w:rPr>
+        <w:t xml:space="preserve">║  25–40 Kuus tuuma + maapähklid                                   ║</w:t>
+      </w:r>
+      <w:r>
+        <w:br/>
+      </w:r>
+      <w:r>
+        <w:rPr>
+          <w:rStyle w:val="VerbatimChar"/>
+        </w:rPr>
+        <w:t xml:space="preserve">║  40–55 Praktika: kütmine / naer / liikumine                      ║</w:t>
+      </w:r>
+      <w:r>
+        <w:br/>
+      </w:r>
+      <w:r>
+        <w:rPr>
+          <w:rStyle w:val="VerbatimChar"/>
+        </w:rPr>
+        <w:t xml:space="preserve">║  55–70 Kogukond — 90 päeva plaan                                 ║</w:t>
+      </w:r>
+      <w:r>
+        <w:br/>
+      </w:r>
+      <w:r>
+        <w:rPr>
+          <w:rStyle w:val="VerbatimChar"/>
+        </w:rPr>
+        <w:t xml:space="preserve">║  70–90 Refleksioon + kodutöö                                     ║</w:t>
+      </w:r>
+      <w:r>
+        <w:br/>
+      </w:r>
+      <w:r>
+        <w:rPr>
+          <w:rStyle w:val="VerbatimChar"/>
+        </w:rPr>
+        <w:t xml:space="preserve">╠══════════════════════════════════════════════════════════════════╣</w:t>
+      </w:r>
+      <w:r>
+        <w:br/>
+      </w:r>
+      <w:r>
+        <w:rPr>
+          <w:rStyle w:val="VerbatimChar"/>
+        </w:rPr>
+        <w:t xml:space="preserve">║  LÕPETUSSÕNA (loe valjusti)                                      ║</w:t>
+      </w:r>
+      <w:r>
+        <w:br/>
+      </w:r>
+      <w:r>
+        <w:rPr>
+          <w:rStyle w:val="VerbatimChar"/>
+        </w:rPr>
+        <w:t xml:space="preserve">║  „Maailm on seened ja putukad. Sina oled imetaja, kes tahab      ║</w:t>
+      </w:r>
+      <w:r>
+        <w:br/>
+      </w:r>
+      <w:r>
+        <w:rPr>
+          <w:rStyle w:val="VerbatimChar"/>
+        </w:rPr>
+        <w:t xml:space="preserve">║   turvaliselt koos naerda. See on piisavalt lihtne."             ║</w:t>
+      </w:r>
+      <w:r>
+        <w:br/>
+      </w:r>
+      <w:r>
+        <w:rPr>
+          <w:rStyle w:val="VerbatimChar"/>
+        </w:rPr>
+        <w:t xml:space="preserve">╚══════════════════════════════════════════════════════════════════╝</w:t>
       </w:r>
     </w:p>
     <w:p>
@@ -318,239 +600,13 @@
       </w:r>
     </w:p>
     <w:bookmarkEnd w:id="20"/>
-    <w:bookmarkStart w:id="21" w:name="X8428aed05e1ef62624a7f56e484d04adf92db9c"/>
+    <w:bookmarkStart w:id="21" w:name="X8addba6ff0fb86ad967f09a5528b42ba1547497"/>
     <w:p>
       <w:pPr>
         <w:pStyle w:val="Heading2"/>
       </w:pPr>
       <w:r>
-        <w:t xml:space="preserve">KIIRE KAART (koolitajale — prindi eraldi lehele)</w:t>
-      </w:r>
-    </w:p>
-    <w:p>
-      <w:pPr>
-        <w:pStyle w:val="SourceCode"/>
-      </w:pPr>
-      <w:r>
-        <w:rPr>
-          <w:rStyle w:val="VerbatimChar"/>
-        </w:rPr>
-        <w:t xml:space="preserve">┌─────────────────────────────────────────────────────────────┐</w:t>
-      </w:r>
-      <w:r>
-        <w:br/>
-      </w:r>
-      <w:r>
-        <w:rPr>
-          <w:rStyle w:val="VerbatimChar"/>
-        </w:rPr>
-        <w:t xml:space="preserve">│  KK1 — INIMLIK TUUM · 90 min                                 │</w:t>
-      </w:r>
-      <w:r>
-        <w:br/>
-      </w:r>
-      <w:r>
-        <w:rPr>
-          <w:rStyle w:val="VerbatimChar"/>
-        </w:rPr>
-        <w:t xml:space="preserve">├─────────────────────────────────────────────────────────────┤</w:t>
-      </w:r>
-      <w:r>
-        <w:br/>
-      </w:r>
-      <w:r>
-        <w:rPr>
-          <w:rStyle w:val="VerbatimChar"/>
-        </w:rPr>
-        <w:t xml:space="preserve">│  EESMÄRK: Osaleja tunneb turvaliselt ja nimetab 6 tuuma.    │</w:t>
-      </w:r>
-      <w:r>
-        <w:br/>
-      </w:r>
-      <w:r>
-        <w:rPr>
-          <w:rStyle w:val="VerbatimChar"/>
-        </w:rPr>
-        <w:t xml:space="preserve">│                                                             │</w:t>
-      </w:r>
-      <w:r>
-        <w:br/>
-      </w:r>
-      <w:r>
-        <w:rPr>
-          <w:rStyle w:val="VerbatimChar"/>
-        </w:rPr>
-        <w:t xml:space="preserve">│  TUNNISKEEM:                                                │</w:t>
-      </w:r>
-      <w:r>
-        <w:br/>
-      </w:r>
-      <w:r>
-        <w:rPr>
-          <w:rStyle w:val="VerbatimChar"/>
-        </w:rPr>
-        <w:t xml:space="preserve">│  0–10   Avamine + turvalisus (Lisa P)                       │</w:t>
-      </w:r>
-      <w:r>
-        <w:br/>
-      </w:r>
-      <w:r>
-        <w:rPr>
-          <w:rStyle w:val="VerbatimChar"/>
-        </w:rPr>
-        <w:t xml:space="preserve">│  10–25  Maailm vs inimene — seened, putukad, 65 imetajat    │</w:t>
-      </w:r>
-      <w:r>
-        <w:br/>
-      </w:r>
-      <w:r>
-        <w:rPr>
-          <w:rStyle w:val="VerbatimChar"/>
-        </w:rPr>
-        <w:t xml:space="preserve">│  25–40  Kuus tuuma: naer, puudutus, toit, mäng, looming     │</w:t>
-      </w:r>
-      <w:r>
-        <w:br/>
-      </w:r>
-      <w:r>
-        <w:rPr>
-          <w:rStyle w:val="VerbatimChar"/>
-        </w:rPr>
-        <w:t xml:space="preserve">│  40–55  Praktika: kütmine + naer + liikumine (3 rühma)      │</w:t>
-      </w:r>
-      <w:r>
-        <w:br/>
-      </w:r>
-      <w:r>
-        <w:rPr>
-          <w:rStyle w:val="VerbatimChar"/>
-        </w:rPr>
-        <w:t xml:space="preserve">│  55–70  Kogukond — 90 päeva plaan (Lisa BI)                 │</w:t>
-      </w:r>
-      <w:r>
-        <w:br/>
-      </w:r>
-      <w:r>
-        <w:rPr>
-          <w:rStyle w:val="VerbatimChar"/>
-        </w:rPr>
-        <w:t xml:space="preserve">│  70–85  Refleksioon + üks lause naabrile                    │</w:t>
-      </w:r>
-      <w:r>
-        <w:br/>
-      </w:r>
-      <w:r>
-        <w:rPr>
-          <w:rStyle w:val="VerbatimChar"/>
-        </w:rPr>
-        <w:t xml:space="preserve">│  85–90  Lõpetus + kodutöö                                   │</w:t>
-      </w:r>
-      <w:r>
-        <w:br/>
-      </w:r>
-      <w:r>
-        <w:rPr>
-          <w:rStyle w:val="VerbatimChar"/>
-        </w:rPr>
-        <w:t xml:space="preserve">│                                                             │</w:t>
-      </w:r>
-      <w:r>
-        <w:br/>
-      </w:r>
-      <w:r>
-        <w:rPr>
-          <w:rStyle w:val="VerbatimChar"/>
-        </w:rPr>
-        <w:t xml:space="preserve">│  REEGLID:                                                   │</w:t>
-      </w:r>
-      <w:r>
-        <w:br/>
-      </w:r>
-      <w:r>
-        <w:rPr>
-          <w:rStyle w:val="VerbatimChar"/>
-        </w:rPr>
-        <w:t xml:space="preserve">│  · Keha enne mõistust (Lisa P)                              │</w:t>
-      </w:r>
-      <w:r>
-        <w:br/>
-      </w:r>
-      <w:r>
-        <w:rPr>
-          <w:rStyle w:val="VerbatimChar"/>
-        </w:rPr>
-        <w:t xml:space="preserve">│  · Ei sunni intiimsust — puudutus ainult nõusolekuga        │</w:t>
-      </w:r>
-      <w:r>
-        <w:br/>
-      </w:r>
-      <w:r>
-        <w:rPr>
-          <w:rStyle w:val="VerbatimChar"/>
-        </w:rPr>
-        <w:t xml:space="preserve">│  · Trauma olekus — ruum, mitte debatt                       │</w:t>
-      </w:r>
-      <w:r>
-        <w:br/>
-      </w:r>
-      <w:r>
-        <w:rPr>
-          <w:rStyle w:val="VerbatimChar"/>
-        </w:rPr>
-        <w:t xml:space="preserve">│  · Ära usu oma aju esimest mõtet (Lisa AW)                  │</w:t>
-      </w:r>
-      <w:r>
-        <w:br/>
-      </w:r>
-      <w:r>
-        <w:rPr>
-          <w:rStyle w:val="VerbatimChar"/>
-        </w:rPr>
-        <w:t xml:space="preserve">│                                                             │</w:t>
-      </w:r>
-      <w:r>
-        <w:br/>
-      </w:r>
-      <w:r>
-        <w:rPr>
-          <w:rStyle w:val="VerbatimChar"/>
-        </w:rPr>
-        <w:t xml:space="preserve">│  MATERJALID: pliiats, paber, üks pott/pann, liivamätt,      │</w:t>
-      </w:r>
-      <w:r>
-        <w:br/>
-      </w:r>
-      <w:r>
-        <w:rPr>
-          <w:rStyle w:val="VerbatimChar"/>
-        </w:rPr>
-        <w:t xml:space="preserve">│  joogikraani foto või QR (Lisa BG), timer 90 sek             │</w:t>
-      </w:r>
-      <w:r>
-        <w:br/>
-      </w:r>
-      <w:r>
-        <w:rPr>
-          <w:rStyle w:val="VerbatimChar"/>
-        </w:rPr>
-        <w:t xml:space="preserve">└─────────────────────────────────────────────────────────────┘</w:t>
-      </w:r>
-    </w:p>
-    <w:p>
-      <w:r>
-        <w:pict>
-          <v:rect style="width:0;height:1.5pt" o:hralign="center" o:hrstd="t" o:hr="t"/>
-        </w:pict>
-      </w:r>
-    </w:p>
-    <w:bookmarkEnd w:id="21"/>
-    <w:bookmarkStart w:id="22" w:name="koolituse-eesmärk"/>
-    <w:p>
-      <w:pPr>
-        <w:pStyle w:val="Heading2"/>
-      </w:pPr>
-      <w:r>
-        <w:t xml:space="preserve">1. KOOLITUSE EESMÄRK</w:t>
+        <w:t xml:space="preserve">TUNNIKAVA — täielik sisu (sama kaart, tagakülg või järgmine leht)</w:t>
       </w:r>
     </w:p>
     <w:tbl>
@@ -561,7 +617,11 @@
         <w:jc w:val="start"/>
       </w:tblPr>
       <w:tblGrid>
-        <w:gridCol w:w="7920"/>
+        <w:gridCol w:w="776"/>
+        <w:gridCol w:w="931"/>
+        <w:gridCol w:w="2484"/>
+        <w:gridCol w:w="2174"/>
+        <w:gridCol w:w="1552"/>
       </w:tblGrid>
       <w:tr>
         <w:trPr>
@@ -575,7 +635,55 @@
               <w:jc w:val="left"/>
             </w:pPr>
             <w:r>
-              <w:t xml:space="preserve">Pärast tundi osaleja…</w:t>
+              <w:t xml:space="preserve">Aeg</w:t>
+            </w:r>
+          </w:p>
+        </w:tc>
+        <w:tc>
+          <w:tcPr/>
+          <w:p>
+            <w:pPr>
+              <w:pStyle w:val="Compact"/>
+              <w:jc w:val="left"/>
+            </w:pPr>
+            <w:r>
+              <w:t xml:space="preserve">Faas</w:t>
+            </w:r>
+          </w:p>
+        </w:tc>
+        <w:tc>
+          <w:tcPr/>
+          <w:p>
+            <w:pPr>
+              <w:pStyle w:val="Compact"/>
+              <w:jc w:val="left"/>
+            </w:pPr>
+            <w:r>
+              <w:t xml:space="preserve">Koolitaja teeb</w:t>
+            </w:r>
+          </w:p>
+        </w:tc>
+        <w:tc>
+          <w:tcPr/>
+          <w:p>
+            <w:pPr>
+              <w:pStyle w:val="Compact"/>
+              <w:jc w:val="left"/>
+            </w:pPr>
+            <w:r>
+              <w:t xml:space="preserve">Osaleja teeb</w:t>
+            </w:r>
+          </w:p>
+        </w:tc>
+        <w:tc>
+          <w:tcPr/>
+          <w:p>
+            <w:pPr>
+              <w:pStyle w:val="Compact"/>
+              <w:jc w:val="left"/>
+            </w:pPr>
+            <w:r>
+              <w:t xml:space="preserve">Märkused</w:t>
             </w:r>
           </w:p>
         </w:tc>
@@ -589,23 +697,89 @@
               <w:jc w:val="left"/>
             </w:pPr>
             <w:r>
-              <w:t xml:space="preserve">Oskab nimetada</w:t>
-            </w:r>
-            <w:r>
-              <w:t xml:space="preserve"> </w:t>
-            </w:r>
-            <w:r>
               <w:rPr>
                 <w:bCs/>
                 <w:b/>
               </w:rPr>
-              <w:t xml:space="preserve">kuus inimlikku tuuma</w:t>
+              <w:t xml:space="preserve">0–10</w:t>
+            </w:r>
+          </w:p>
+        </w:tc>
+        <w:tc>
+          <w:tcPr/>
+          <w:p>
+            <w:pPr>
+              <w:pStyle w:val="Compact"/>
+              <w:jc w:val="left"/>
+            </w:pPr>
+            <w:r>
+              <w:rPr>
+                <w:bCs/>
+                <w:b/>
+              </w:rPr>
+              <w:t xml:space="preserve">Avamine + turvalisus</w:t>
+            </w:r>
+          </w:p>
+        </w:tc>
+        <w:tc>
+          <w:tcPr/>
+          <w:p>
+            <w:pPr>
+              <w:pStyle w:val="Compact"/>
+              <w:jc w:val="left"/>
+            </w:pPr>
+            <w:r>
+              <w:t xml:space="preserve">Tervitab. Toolid ringis/U-kujus. Küsi:</w:t>
             </w:r>
             <w:r>
               <w:t xml:space="preserve"> </w:t>
             </w:r>
             <w:r>
-              <w:t xml:space="preserve">(turvalisus, naer, puudutus, kütmine, mäng, looming)</w:t>
+              <w:rPr>
+                <w:iCs/>
+                <w:i/>
+              </w:rPr>
+              <w:t xml:space="preserve">„Kuidas su keha täna tunneb? Üks sõna.”</w:t>
+            </w:r>
+            <w:r>
+              <w:t xml:space="preserve"> </w:t>
+            </w:r>
+            <w:r>
+              <w:t xml:space="preserve">Seadista reeglid (vaikus OK, nõusolek, telefonid, naer lubatud). Ütle:</w:t>
+            </w:r>
+            <w:r>
+              <w:t xml:space="preserve"> </w:t>
+            </w:r>
+            <w:r>
+              <w:rPr>
+                <w:iCs/>
+                <w:i/>
+              </w:rPr>
+              <w:t xml:space="preserve">„Täna ei õpime midagi uut. Me meenutame, mis sa juba tead — enne algoritmi.”</w:t>
+            </w:r>
+          </w:p>
+        </w:tc>
+        <w:tc>
+          <w:tcPr/>
+          <w:p>
+            <w:pPr>
+              <w:pStyle w:val="Compact"/>
+              <w:jc w:val="left"/>
+            </w:pPr>
+            <w:r>
+              <w:t xml:space="preserve">Üks sõna kehast. Kuulab reeglid.</w:t>
+            </w:r>
+          </w:p>
+        </w:tc>
+        <w:tc>
+          <w:tcPr/>
+          <w:p>
+            <w:pPr>
+              <w:pStyle w:val="Compact"/>
+              <w:jc w:val="left"/>
+            </w:pPr>
+            <w:r>
+              <w:t xml:space="preserve">Lisa P · Lisa BC</w:t>
             </w:r>
           </w:p>
         </w:tc>
@@ -619,7 +793,89 @@
               <w:jc w:val="left"/>
             </w:pPr>
             <w:r>
-              <w:t xml:space="preserve">Mõistab paradoksi: maailm on keeruline (34 000+ liiki Eestis), aju tahab lihtsat</w:t>
+              <w:rPr>
+                <w:bCs/>
+                <w:b/>
+              </w:rPr>
+              <w:t xml:space="preserve">10–25</w:t>
+            </w:r>
+          </w:p>
+        </w:tc>
+        <w:tc>
+          <w:tcPr/>
+          <w:p>
+            <w:pPr>
+              <w:pStyle w:val="Compact"/>
+              <w:jc w:val="left"/>
+            </w:pPr>
+            <w:r>
+              <w:rPr>
+                <w:bCs/>
+                <w:b/>
+              </w:rPr>
+              <w:t xml:space="preserve">Maailm vs inimene</w:t>
+            </w:r>
+          </w:p>
+        </w:tc>
+        <w:tc>
+          <w:tcPr/>
+          <w:p>
+            <w:pPr>
+              <w:pStyle w:val="Compact"/>
+              <w:jc w:val="left"/>
+            </w:pPr>
+            <w:r>
+              <w:t xml:space="preserve">Räägi max 8 min: Eestis ~10 000 putukat, ~5 500–7 000 seenet, 34 257+ liiki, 65 imetajat. Seened = eraldi riik. Paradoks: maailm keeruline, aju lihtne. Küsi paarides (3 min):</w:t>
+            </w:r>
+            <w:r>
+              <w:t xml:space="preserve"> </w:t>
+            </w:r>
+            <w:r>
+              <w:rPr>
+                <w:iCs/>
+                <w:i/>
+              </w:rPr>
+              <w:t xml:space="preserve">„Millal tundsid end liiga keerulise maailma all — ja mida keha tahtis?“</w:t>
+            </w:r>
+            <w:r>
+              <w:t xml:space="preserve"> </w:t>
+            </w:r>
+            <w:r>
+              <w:t xml:space="preserve">Kokkuvõte:</w:t>
+            </w:r>
+            <w:r>
+              <w:t xml:space="preserve"> </w:t>
+            </w:r>
+            <w:r>
+              <w:rPr>
+                <w:iCs/>
+                <w:i/>
+              </w:rPr>
+              <w:t xml:space="preserve">Infosõda müüb keerukust. Imetaja aju tahab lihtsat.</w:t>
+            </w:r>
+          </w:p>
+        </w:tc>
+        <w:tc>
+          <w:tcPr/>
+          <w:p>
+            <w:pPr>
+              <w:pStyle w:val="Compact"/>
+              <w:jc w:val="left"/>
+            </w:pPr>
+            <w:r>
+              <w:t xml:space="preserve">Paarivestlus. Kuulab.</w:t>
+            </w:r>
+          </w:p>
+        </w:tc>
+        <w:tc>
+          <w:tcPr/>
+          <w:p>
+            <w:pPr>
+              <w:pStyle w:val="Compact"/>
+              <w:jc w:val="left"/>
+            </w:pPr>
+            <w:r>
+              <w:t xml:space="preserve">Lisa BJ · Lisa AW</w:t>
             </w:r>
           </w:p>
         </w:tc>
@@ -633,20 +889,95 @@
               <w:jc w:val="left"/>
             </w:pPr>
             <w:r>
-              <w:t xml:space="preserve">Teab</w:t>
-            </w:r>
-            <w:r>
-              <w:t xml:space="preserve"> </w:t>
-            </w:r>
-            <w:r>
               <w:rPr>
                 <w:bCs/>
                 <w:b/>
               </w:rPr>
-              <w:t xml:space="preserve">ühe konkreetse sammu</w:t>
-            </w:r>
-            <w:r>
-              <w:t xml:space="preserve">, kuidas kogukonda alustada ilma riigita (Lisa BI)</w:t>
+              <w:t xml:space="preserve">25–40</w:t>
+            </w:r>
+          </w:p>
+        </w:tc>
+        <w:tc>
+          <w:tcPr/>
+          <w:p>
+            <w:pPr>
+              <w:pStyle w:val="Compact"/>
+              <w:jc w:val="left"/>
+            </w:pPr>
+            <w:r>
+              <w:rPr>
+                <w:bCs/>
+                <w:b/>
+              </w:rPr>
+              <w:t xml:space="preserve">Kuus tuuma</w:t>
+            </w:r>
+          </w:p>
+        </w:tc>
+        <w:tc>
+          <w:tcPr/>
+          <w:p>
+            <w:pPr>
+              <w:pStyle w:val="Compact"/>
+              <w:jc w:val="left"/>
+            </w:pPr>
+            <w:r>
+              <w:t xml:space="preserve">Tabel: 0 Turvalisus · 1 Naer · 2 Puudutus · 3 Kütmine · 4 Mäng · 5 Looming (viide OPORD lisadele). Harjutus 5 min: kirjuta üks piirav uskumus —</w:t>
+            </w:r>
+            <w:r>
+              <w:t xml:space="preserve"> </w:t>
+            </w:r>
+            <w:r>
+              <w:rPr>
+                <w:iCs/>
+                <w:i/>
+              </w:rPr>
+              <w:t xml:space="preserve">„tõde või maapähkel?“</w:t>
+            </w:r>
+            <w:r>
+              <w:t xml:space="preserve"> </w:t>
+            </w:r>
+            <w:r>
+              <w:t xml:space="preserve">(Sarnicola). Paarides 5 min:</w:t>
+            </w:r>
+            <w:r>
+              <w:t xml:space="preserve"> </w:t>
+            </w:r>
+            <w:r>
+              <w:rPr>
+                <w:iCs/>
+                <w:i/>
+              </w:rPr>
+              <w:t xml:space="preserve">„Milline tuum on täna tühi?“</w:t>
+            </w:r>
+            <w:r>
+              <w:t xml:space="preserve"> </w:t>
+            </w:r>
+            <w:r>
+              <w:t xml:space="preserve">Hoiatus: intiimsus ainult nõusolekuga; Lisa P enne BH.</w:t>
+            </w:r>
+          </w:p>
+        </w:tc>
+        <w:tc>
+          <w:tcPr/>
+          <w:p>
+            <w:pPr>
+              <w:pStyle w:val="Compact"/>
+              <w:jc w:val="left"/>
+            </w:pPr>
+            <w:r>
+              <w:t xml:space="preserve">Kirjutab. Vestleb paaris.</w:t>
+            </w:r>
+          </w:p>
+        </w:tc>
+        <w:tc>
+          <w:tcPr/>
+          <w:p>
+            <w:pPr>
+              <w:pStyle w:val="Compact"/>
+              <w:jc w:val="left"/>
+            </w:pPr>
+            <w:r>
+              <w:t xml:space="preserve">Lisa AA · BH</w:t>
             </w:r>
           </w:p>
         </w:tc>
@@ -660,23 +991,126 @@
               <w:jc w:val="left"/>
             </w:pPr>
             <w:r>
-              <w:t xml:space="preserve">On kogenud</w:t>
-            </w:r>
-            <w:r>
-              <w:t xml:space="preserve"> </w:t>
-            </w:r>
-            <w:r>
               <w:rPr>
                 <w:bCs/>
                 <w:b/>
               </w:rPr>
-              <w:t xml:space="preserve">kehas</w:t>
+              <w:t xml:space="preserve">40–55</w:t>
+            </w:r>
+          </w:p>
+        </w:tc>
+        <w:tc>
+          <w:tcPr/>
+          <w:p>
+            <w:pPr>
+              <w:pStyle w:val="Compact"/>
+              <w:jc w:val="left"/>
+            </w:pPr>
+            <w:r>
+              <w:rPr>
+                <w:bCs/>
+                <w:b/>
+              </w:rPr>
+              <w:t xml:space="preserve">Praktika — kehas</w:t>
+            </w:r>
+          </w:p>
+        </w:tc>
+        <w:tc>
+          <w:tcPr/>
+          <w:p>
+            <w:pPr>
+              <w:pStyle w:val="Compact"/>
+              <w:jc w:val="left"/>
+            </w:pPr>
+            <w:r>
+              <w:t xml:space="preserve">Jaga 3 rühma, igaüks 5 min, siis vahetus.</w:t>
             </w:r>
             <w:r>
               <w:t xml:space="preserve"> </w:t>
             </w:r>
             <w:r>
-              <w:t xml:space="preserve">vähemalt kaks tuuma (naer + liikumine või ühine toit)</w:t>
+              <w:rPr>
+                <w:bCs/>
+                <w:b/>
+              </w:rPr>
+              <w:t xml:space="preserve">A Kütmine:</w:t>
+            </w:r>
+            <w:r>
+              <w:t xml:space="preserve"> </w:t>
+            </w:r>
+            <w:r>
+              <w:t xml:space="preserve">üks valmistab (tee/võileib), teised aitavad; enne sööki: *„Kellele ma täna hoolin?</w:t>
+            </w:r>
+            <w:r>
+              <w:t xml:space="preserve">“</w:t>
+            </w:r>
+            <w:r>
+              <w:t xml:space="preserve">*</w:t>
+            </w:r>
+            <w:r>
+              <w:t xml:space="preserve"> </w:t>
+            </w:r>
+            <w:r>
+              <w:rPr>
+                <w:bCs/>
+                <w:b/>
+              </w:rPr>
+              <w:t xml:space="preserve">B Naer:</w:t>
+            </w:r>
+            <w:r>
+              <w:t xml:space="preserve"> </w:t>
+            </w:r>
+            <w:r>
+              <w:t xml:space="preserve">ring, mäng „ei naera</w:t>
+            </w:r>
+            <w:r>
+              <w:t xml:space="preserve">”</w:t>
+            </w:r>
+            <w:r>
+              <w:t xml:space="preserve"> </w:t>
+            </w:r>
+            <w:r>
+              <w:t xml:space="preserve">10 sek, lase naerul tulla.</w:t>
+            </w:r>
+            <w:r>
+              <w:t xml:space="preserve"> </w:t>
+            </w:r>
+            <w:r>
+              <w:rPr>
+                <w:bCs/>
+                <w:b/>
+              </w:rPr>
+              <w:t xml:space="preserve">C Liikumine:</w:t>
+            </w:r>
+            <w:r>
+              <w:t xml:space="preserve"> </w:t>
+            </w:r>
+            <w:r>
+              <w:t xml:space="preserve">90 sek rippumine/kükk/plank; kerge maadlemismäng (piirid, mitte võitlus). Tagasi ringi — üks sõna kehast igaühelt.</w:t>
+            </w:r>
+          </w:p>
+        </w:tc>
+        <w:tc>
+          <w:tcPr/>
+          <w:p>
+            <w:pPr>
+              <w:pStyle w:val="Compact"/>
+              <w:jc w:val="left"/>
+            </w:pPr>
+            <w:r>
+              <w:t xml:space="preserve">Osaleb kõigis 3 rühmas.</w:t>
+            </w:r>
+          </w:p>
+        </w:tc>
+        <w:tc>
+          <w:tcPr/>
+          <w:p>
+            <w:pPr>
+              <w:pStyle w:val="Compact"/>
+              <w:jc w:val="left"/>
+            </w:pPr>
+            <w:r>
+              <w:t xml:space="preserve">Lisa U · AB · BJ</w:t>
             </w:r>
           </w:p>
         </w:tc>
@@ -690,7 +1124,232 @@
               <w:jc w:val="left"/>
             </w:pPr>
             <w:r>
-              <w:t xml:space="preserve">Oskab öelda ühe lause, mida naabrile öelda</w:t>
+              <w:rPr>
+                <w:bCs/>
+                <w:b/>
+              </w:rPr>
+              <w:t xml:space="preserve">55–70</w:t>
+            </w:r>
+          </w:p>
+        </w:tc>
+        <w:tc>
+          <w:tcPr/>
+          <w:p>
+            <w:pPr>
+              <w:pStyle w:val="Compact"/>
+              <w:jc w:val="left"/>
+            </w:pPr>
+            <w:r>
+              <w:rPr>
+                <w:bCs/>
+                <w:b/>
+              </w:rPr>
+              <w:t xml:space="preserve">Kogukond</w:t>
+            </w:r>
+          </w:p>
+        </w:tc>
+        <w:tc>
+          <w:tcPr/>
+          <w:p>
+            <w:pPr>
+              <w:pStyle w:val="Compact"/>
+              <w:jc w:val="left"/>
+            </w:pPr>
+            <w:r>
+              <w:t xml:space="preserve">5 min: Lisa BI viis mudelit (koht, talgud, kolmas koht, ressurss, rituaal). 7 min iseseisev töö — täida plaan (allpool). 3 min: igaüks loeb ühe rea valjusti. Anna ette lause naabrile.</w:t>
+            </w:r>
+          </w:p>
+        </w:tc>
+        <w:tc>
+          <w:tcPr/>
+          <w:p>
+            <w:pPr>
+              <w:pStyle w:val="Compact"/>
+              <w:jc w:val="left"/>
+            </w:pPr>
+            <w:r>
+              <w:t xml:space="preserve">Täidab 90-päeva plaani. Jagab ühe sammu.</w:t>
+            </w:r>
+          </w:p>
+        </w:tc>
+        <w:tc>
+          <w:tcPr/>
+          <w:p>
+            <w:pPr>
+              <w:pStyle w:val="Compact"/>
+              <w:jc w:val="left"/>
+            </w:pPr>
+            <w:r>
+              <w:t xml:space="preserve">Lisa BI</w:t>
+            </w:r>
+          </w:p>
+        </w:tc>
+      </w:tr>
+      <w:tr>
+        <w:tc>
+          <w:tcPr/>
+          <w:p>
+            <w:pPr>
+              <w:pStyle w:val="Compact"/>
+              <w:jc w:val="left"/>
+            </w:pPr>
+            <w:r>
+              <w:rPr>
+                <w:bCs/>
+                <w:b/>
+              </w:rPr>
+              <w:t xml:space="preserve">70–85</w:t>
+            </w:r>
+          </w:p>
+        </w:tc>
+        <w:tc>
+          <w:tcPr/>
+          <w:p>
+            <w:pPr>
+              <w:pStyle w:val="Compact"/>
+              <w:jc w:val="left"/>
+            </w:pPr>
+            <w:r>
+              <w:rPr>
+                <w:bCs/>
+                <w:b/>
+              </w:rPr>
+              <w:t xml:space="preserve">Refleksioon</w:t>
+            </w:r>
+          </w:p>
+        </w:tc>
+        <w:tc>
+          <w:tcPr/>
+          <w:p>
+            <w:pPr>
+              <w:pStyle w:val="Compact"/>
+              <w:jc w:val="left"/>
+            </w:pPr>
+            <w:r>
+              <w:t xml:space="preserve">Ringis spordikommentaator (Lisa P): igaüks</w:t>
+            </w:r>
+            <w:r>
+              <w:t xml:space="preserve"> </w:t>
+            </w:r>
+            <w:r>
+              <w:rPr>
+                <w:bCs/>
+                <w:b/>
+              </w:rPr>
+              <w:t xml:space="preserve">üks lause</w:t>
+            </w:r>
+            <w:r>
+              <w:t xml:space="preserve">, mida nägi/tundis — mitte arvamust. Näide:</w:t>
+            </w:r>
+            <w:r>
+              <w:t xml:space="preserve"> </w:t>
+            </w:r>
+            <w:r>
+              <w:rPr>
+                <w:iCs/>
+                <w:i/>
+              </w:rPr>
+              <w:t xml:space="preserve">„Pärast naeru oli kergem hingata.”</w:t>
+            </w:r>
+            <w:r>
+              <w:t xml:space="preserve"> </w:t>
+            </w:r>
+            <w:r>
+              <w:t xml:space="preserve">Kokkuvõte 3 min: TURVALISUS → NAER → PUUDUTUS → KÜTmine → MÄNG → LOOMING → KOGUKOND.</w:t>
+            </w:r>
+          </w:p>
+        </w:tc>
+        <w:tc>
+          <w:tcPr/>
+          <w:p>
+            <w:pPr>
+              <w:pStyle w:val="Compact"/>
+              <w:jc w:val="left"/>
+            </w:pPr>
+            <w:r>
+              <w:t xml:space="preserve">Üks lause ringis.</w:t>
+            </w:r>
+          </w:p>
+        </w:tc>
+        <w:tc>
+          <w:tcPr/>
+          <w:p>
+            <w:pPr>
+              <w:pStyle w:val="Compact"/>
+              <w:jc w:val="left"/>
+            </w:pPr>
+            <w:r>
+              <w:t xml:space="preserve">Lisa P · AD</w:t>
+            </w:r>
+          </w:p>
+        </w:tc>
+      </w:tr>
+      <w:tr>
+        <w:tc>
+          <w:tcPr/>
+          <w:p>
+            <w:pPr>
+              <w:pStyle w:val="Compact"/>
+              <w:jc w:val="left"/>
+            </w:pPr>
+            <w:r>
+              <w:rPr>
+                <w:bCs/>
+                <w:b/>
+              </w:rPr>
+              <w:t xml:space="preserve">85–90</w:t>
+            </w:r>
+          </w:p>
+        </w:tc>
+        <w:tc>
+          <w:tcPr/>
+          <w:p>
+            <w:pPr>
+              <w:pStyle w:val="Compact"/>
+              <w:jc w:val="left"/>
+            </w:pPr>
+            <w:r>
+              <w:rPr>
+                <w:bCs/>
+                <w:b/>
+              </w:rPr>
+              <w:t xml:space="preserve">Lõpetus</w:t>
+            </w:r>
+          </w:p>
+        </w:tc>
+        <w:tc>
+          <w:tcPr/>
+          <w:p>
+            <w:pPr>
+              <w:pStyle w:val="Compact"/>
+              <w:jc w:val="left"/>
+            </w:pPr>
+            <w:r>
+              <w:t xml:space="preserve">Kodutöö: üks tuum päevas; räägi ühe naabrig; loe Lisa BI või Sarnicola ET. Lõpetussõna (kaardilt).</w:t>
+            </w:r>
+          </w:p>
+        </w:tc>
+        <w:tc>
+          <w:tcPr/>
+          <w:p>
+            <w:pPr>
+              <w:pStyle w:val="Compact"/>
+              <w:jc w:val="left"/>
+            </w:pPr>
+            <w:r>
+              <w:t xml:space="preserve">Pane kirja üks samm nädalaks.</w:t>
+            </w:r>
+          </w:p>
+        </w:tc>
+        <w:tc>
+          <w:tcPr/>
+          <w:p>
+            <w:pPr>
+              <w:pStyle w:val="Compact"/>
+              <w:jc w:val="left"/>
+            </w:pPr>
+            <w:r>
+              <w:t xml:space="preserve">—</w:t>
             </w:r>
           </w:p>
         </w:tc>
@@ -703,123 +1362,94 @@
         </w:pict>
       </w:r>
     </w:p>
-    <w:bookmarkEnd w:id="22"/>
-    <w:bookmarkStart w:id="23" w:name="õpieesmärgid-smart"/>
+    <w:bookmarkEnd w:id="21"/>
+    <w:bookmarkStart w:id="22" w:name="X02b0d1e01b7c5e5c063acae252ea65e06b96b70"/>
     <w:p>
       <w:pPr>
         <w:pStyle w:val="Heading2"/>
       </w:pPr>
       <w:r>
-        <w:t xml:space="preserve">2. ÕPIEESMÄRGID (SMART)</w:t>
+        <w:t xml:space="preserve">OSALEJA TÖÖLEHT (jaga või kirjuta tahvlile)</w:t>
       </w:r>
     </w:p>
     <w:p>
       <w:pPr>
-        <w:numPr>
-          <w:ilvl w:val="0"/>
-          <w:numId w:val="1001"/>
-        </w:numPr>
-        <w:pStyle w:val="Compact"/>
+        <w:pStyle w:val="SourceCode"/>
       </w:pPr>
       <w:r>
-        <w:t xml:space="preserve">Osaleja kirjutab üles</w:t>
+        <w:rPr>
+          <w:rStyle w:val="VerbatimChar"/>
+        </w:rPr>
+        <w:t xml:space="preserve">MINU 90 PÄEVA — ESIMENE SAMM</w:t>
       </w:r>
       <w:r>
-        <w:t xml:space="preserve"> </w:t>
+        <w:br/>
+      </w:r>
+      <w:r>
+        <w:br/>
       </w:r>
       <w:r>
         <w:rPr>
-          <w:bCs/>
-          <w:b/>
+          <w:rStyle w:val="VerbatimChar"/>
         </w:rPr>
-        <w:t xml:space="preserve">3 asja</w:t>
+        <w:t xml:space="preserve">□ Räägin 5 naabriga: _________________________________</w:t>
       </w:r>
       <w:r>
-        <w:t xml:space="preserve">, mida ta tahab turvaliselt koos teha (isiklik).</w:t>
-      </w:r>
-    </w:p>
-    <w:p>
-      <w:pPr>
-        <w:numPr>
-          <w:ilvl w:val="0"/>
-          <w:numId w:val="1001"/>
-        </w:numPr>
-        <w:pStyle w:val="Compact"/>
-      </w:pPr>
-      <w:r>
-        <w:t xml:space="preserve">Osaleja osaleb vähemalt</w:t>
-      </w:r>
-      <w:r>
-        <w:t xml:space="preserve"> </w:t>
+        <w:br/>
       </w:r>
       <w:r>
         <w:rPr>
-          <w:bCs/>
-          <w:b/>
+          <w:rStyle w:val="VerbatimChar"/>
         </w:rPr>
-        <w:t xml:space="preserve">ühes rühmapraktikas</w:t>
+        <w:t xml:space="preserve">□ Leian ühe koha (õu/park/trepikoda): ________________</w:t>
       </w:r>
       <w:r>
-        <w:t xml:space="preserve"> </w:t>
-      </w:r>
-      <w:r>
-        <w:t xml:space="preserve">(kütmine / naer / liikumine).</w:t>
-      </w:r>
-    </w:p>
-    <w:p>
-      <w:pPr>
-        <w:numPr>
-          <w:ilvl w:val="0"/>
-          <w:numId w:val="1001"/>
-        </w:numPr>
-        <w:pStyle w:val="Compact"/>
-      </w:pPr>
-      <w:r>
-        <w:t xml:space="preserve">Osaleja täidab</w:t>
-      </w:r>
-      <w:r>
-        <w:t xml:space="preserve"> </w:t>
+        <w:br/>
       </w:r>
       <w:r>
         <w:rPr>
-          <w:bCs/>
-          <w:b/>
+          <w:rStyle w:val="VerbatimChar"/>
         </w:rPr>
-        <w:t xml:space="preserve">90-päeva plaani</w:t>
+        <w:t xml:space="preserve">□ Esimene kohtumine (kuupäev): _______________________</w:t>
       </w:r>
       <w:r>
-        <w:t xml:space="preserve"> </w:t>
-      </w:r>
-      <w:r>
-        <w:t xml:space="preserve">esimese sammu (5 naabrit / üks koht).</w:t>
-      </w:r>
-    </w:p>
-    <w:p>
-      <w:pPr>
-        <w:numPr>
-          <w:ilvl w:val="0"/>
-          <w:numId w:val="1001"/>
-        </w:numPr>
-        <w:pStyle w:val="Compact"/>
-      </w:pPr>
-      <w:r>
-        <w:t xml:space="preserve">Osaleja ütleb lõpus</w:t>
-      </w:r>
-      <w:r>
-        <w:t xml:space="preserve"> </w:t>
+        <w:br/>
       </w:r>
       <w:r>
         <w:rPr>
-          <w:bCs/>
-          <w:b/>
+          <w:rStyle w:val="VerbatimChar"/>
         </w:rPr>
-        <w:t xml:space="preserve">valjusti ühe lause</w:t>
+        <w:t xml:space="preserve">□ Esimene rituaal (iga nädal): _______________________</w:t>
       </w:r>
       <w:r>
-        <w:t xml:space="preserve"> </w:t>
+        <w:br/>
       </w:r>
       <w:r>
-        <w:t xml:space="preserve">kokkuvõtet.</w:t>
+        <w:br/>
+      </w:r>
+      <w:r>
+        <w:rPr>
+          <w:rStyle w:val="VerbatimChar"/>
+        </w:rPr>
+        <w:t xml:space="preserve">ÜKS LAUSE NAABRILE:</w:t>
+      </w:r>
+      <w:r>
+        <w:br/>
+      </w:r>
+      <w:r>
+        <w:rPr>
+          <w:rStyle w:val="VerbatimChar"/>
+        </w:rPr>
+        <w:t xml:space="preserve">„Tahan, et meie kvartalis oleks koht, kus lapsed mängivad</w:t>
+      </w:r>
+      <w:r>
+        <w:br/>
+      </w:r>
+      <w:r>
+        <w:rPr>
+          <w:rStyle w:val="VerbatimChar"/>
+        </w:rPr>
+        <w:t xml:space="preserve"> ja me räägime — kas oled nõus üks kord kuus kohtuma?"</w:t>
       </w:r>
     </w:p>
     <w:p>
@@ -829,571 +1459,14 @@
         </w:pict>
       </w:r>
     </w:p>
-    <w:bookmarkEnd w:id="23"/>
-    <w:bookmarkStart w:id="33" w:name="tunni-sisu-90-min"/>
+    <w:bookmarkEnd w:id="22"/>
+    <w:bookmarkStart w:id="23" w:name="kuus-tuuma-koolitaja-meeldetuletus"/>
     <w:p>
       <w:pPr>
         <w:pStyle w:val="Heading2"/>
       </w:pPr>
       <w:r>
-        <w:t xml:space="preserve">3. TUNNI SISU (90 min)</w:t>
-      </w:r>
-    </w:p>
-    <w:bookmarkStart w:id="24" w:name="faas-0-avamine-ja-turvalisus-010-min"/>
-    <w:p>
-      <w:pPr>
-        <w:pStyle w:val="Heading3"/>
-      </w:pPr>
-      <w:r>
-        <w:t xml:space="preserve">Faas 0 — Avamine ja turvalisus (0–10 min)</w:t>
-      </w:r>
-    </w:p>
-    <w:p>
-      <w:pPr>
-        <w:pStyle w:val="FirstParagraph"/>
-      </w:pPr>
-      <w:r>
-        <w:rPr>
-          <w:bCs/>
-          <w:b/>
-        </w:rPr>
-        <w:t xml:space="preserve">Koolitaja teeb:</w:t>
-      </w:r>
-      <w:r>
-        <w:t xml:space="preserve"> </w:t>
-      </w:r>
-      <w:r>
-        <w:t xml:space="preserve">- Tervitab. Ei alusta teooriast — alusta ruumist.</w:t>
-      </w:r>
-      <w:r>
-        <w:t xml:space="preserve"> </w:t>
-      </w:r>
-      <w:r>
-        <w:t xml:space="preserve">- Küsi:</w:t>
-      </w:r>
-      <w:r>
-        <w:t xml:space="preserve"> </w:t>
-      </w:r>
-      <w:r>
-        <w:rPr>
-          <w:iCs/>
-          <w:i/>
-        </w:rPr>
-        <w:t xml:space="preserve">„Kuidas su keha täna tunneb? Üks sõna.”</w:t>
-      </w:r>
-      <w:r>
-        <w:t xml:space="preserve"> </w:t>
-      </w:r>
-      <w:r>
-        <w:t xml:space="preserve">(ringis, vabatahtlikult)</w:t>
-      </w:r>
-      <w:r>
-        <w:t xml:space="preserve"> </w:t>
-      </w:r>
-      <w:r>
-        <w:t xml:space="preserve">- Seadista reeglid:</w:t>
-      </w:r>
-    </w:p>
-    <w:tbl>
-      <w:tblPr>
-        <w:tblStyle w:val="Table"/>
-        <w:tblW w:type="auto" w:w="0"/>
-        <w:tblLook w:firstRow="1" w:lastRow="0" w:firstColumn="0" w:lastColumn="0" w:noHBand="0" w:noVBand="0" w:val="0020"/>
-        <w:jc w:val="start"/>
-      </w:tblPr>
-      <w:tblGrid>
-        <w:gridCol w:w="3960"/>
-        <w:gridCol w:w="3960"/>
-      </w:tblGrid>
-      <w:tr>
-        <w:trPr>
-          <w:tblHeader w:val="true"/>
-        </w:trPr>
-        <w:tc>
-          <w:tcPr/>
-          <w:p>
-            <w:pPr>
-              <w:pStyle w:val="Compact"/>
-              <w:jc w:val="left"/>
-            </w:pPr>
-            <w:r>
-              <w:t xml:space="preserve">Reegel</w:t>
-            </w:r>
-          </w:p>
-        </w:tc>
-        <w:tc>
-          <w:tcPr/>
-          <w:p>
-            <w:pPr>
-              <w:pStyle w:val="Compact"/>
-              <w:jc w:val="left"/>
-            </w:pPr>
-            <w:r>
-              <w:t xml:space="preserve">Põhjus</w:t>
-            </w:r>
-          </w:p>
-        </w:tc>
-      </w:tr>
-      <w:tr>
-        <w:tc>
-          <w:tcPr/>
-          <w:p>
-            <w:pPr>
-              <w:pStyle w:val="Compact"/>
-              <w:jc w:val="left"/>
-            </w:pPr>
-            <w:r>
-              <w:t xml:space="preserve">Võid vaikida</w:t>
-            </w:r>
-          </w:p>
-        </w:tc>
-        <w:tc>
-          <w:tcPr/>
-          <w:p>
-            <w:pPr>
-              <w:pStyle w:val="Compact"/>
-              <w:jc w:val="left"/>
-            </w:pPr>
-            <w:r>
-              <w:t xml:space="preserve">Turvalisus (Lisa P)</w:t>
-            </w:r>
-          </w:p>
-        </w:tc>
-      </w:tr>
-      <w:tr>
-        <w:tc>
-          <w:tcPr/>
-          <w:p>
-            <w:pPr>
-              <w:pStyle w:val="Compact"/>
-              <w:jc w:val="left"/>
-            </w:pPr>
-            <w:r>
-              <w:t xml:space="preserve">Võid öelda „ei” puudutusele</w:t>
-            </w:r>
-          </w:p>
-        </w:tc>
-        <w:tc>
-          <w:tcPr/>
-          <w:p>
-            <w:pPr>
-              <w:pStyle w:val="Compact"/>
-              <w:jc w:val="left"/>
-            </w:pPr>
-            <w:r>
-              <w:t xml:space="preserve">Nõusolek</w:t>
-            </w:r>
-          </w:p>
-        </w:tc>
-      </w:tr>
-      <w:tr>
-        <w:tc>
-          <w:tcPr/>
-          <w:p>
-            <w:pPr>
-              <w:pStyle w:val="Compact"/>
-              <w:jc w:val="left"/>
-            </w:pPr>
-            <w:r>
-              <w:t xml:space="preserve">Telefonid välja / hääletu</w:t>
-            </w:r>
-          </w:p>
-        </w:tc>
-        <w:tc>
-          <w:tcPr/>
-          <w:p>
-            <w:pPr>
-              <w:pStyle w:val="Compact"/>
-              <w:jc w:val="left"/>
-            </w:pPr>
-            <w:r>
-              <w:t xml:space="preserve">Kohalolek (Lisa BC)</w:t>
-            </w:r>
-          </w:p>
-        </w:tc>
-      </w:tr>
-      <w:tr>
-        <w:tc>
-          <w:tcPr/>
-          <w:p>
-            <w:pPr>
-              <w:pStyle w:val="Compact"/>
-              <w:jc w:val="left"/>
-            </w:pPr>
-            <w:r>
-              <w:t xml:space="preserve">Naer on lubatud</w:t>
-            </w:r>
-          </w:p>
-        </w:tc>
-        <w:tc>
-          <w:tcPr/>
-          <w:p>
-            <w:pPr>
-              <w:pStyle w:val="Compact"/>
-              <w:jc w:val="left"/>
-            </w:pPr>
-            <w:r>
-              <w:t xml:space="preserve">Endorfiin, side (Lisa BJ)</w:t>
-            </w:r>
-          </w:p>
-        </w:tc>
-      </w:tr>
-    </w:tbl>
-    <w:p>
-      <w:pPr>
-        <w:pStyle w:val="BodyText"/>
-      </w:pPr>
-      <w:r>
-        <w:rPr>
-          <w:bCs/>
-          <w:b/>
-        </w:rPr>
-        <w:t xml:space="preserve">Üks lause gruppile:</w:t>
-      </w:r>
-      <w:r>
-        <w:t xml:space="preserve"> </w:t>
-      </w:r>
-      <w:r>
-        <w:t xml:space="preserve">&gt;</w:t>
-      </w:r>
-      <w:r>
-        <w:t xml:space="preserve"> </w:t>
-      </w:r>
-      <w:r>
-        <w:rPr>
-          <w:iCs/>
-          <w:i/>
-        </w:rPr>
-        <w:t xml:space="preserve">„Täna ei õpime midagi uut. Me meenutame, mis sa juba tead — enne algoritmi.”</w:t>
-      </w:r>
-    </w:p>
-    <w:p>
-      <w:pPr>
-        <w:pStyle w:val="BodyText"/>
-      </w:pPr>
-      <w:r>
-        <w:rPr>
-          <w:bCs/>
-          <w:b/>
-        </w:rPr>
-        <w:t xml:space="preserve">Materjal:</w:t>
-      </w:r>
-      <w:r>
-        <w:t xml:space="preserve"> </w:t>
-      </w:r>
-      <w:r>
-        <w:t xml:space="preserve">pole. Ainult toolid ringis või U-kujus (mitte klassiruumi pingid).</w:t>
-      </w:r>
-    </w:p>
-    <w:p>
-      <w:r>
-        <w:pict>
-          <v:rect style="width:0;height:1.5pt" o:hralign="center" o:hrstd="t" o:hr="t"/>
-        </w:pict>
-      </w:r>
-    </w:p>
-    <w:bookmarkEnd w:id="24"/>
-    <w:bookmarkStart w:id="25" w:name="X8a0c985f66c166381c7c68f5bc92930722927bd"/>
-    <w:p>
-      <w:pPr>
-        <w:pStyle w:val="Heading3"/>
-      </w:pPr>
-      <w:r>
-        <w:t xml:space="preserve">Faas 1 — Maailm on tohutu, sina oled lihtne (10–25 min)</w:t>
-      </w:r>
-    </w:p>
-    <w:p>
-      <w:pPr>
-        <w:pStyle w:val="FirstParagraph"/>
-      </w:pPr>
-      <w:r>
-        <w:rPr>
-          <w:bCs/>
-          <w:b/>
-        </w:rPr>
-        <w:t xml:space="preserve">Koolitaja räägib (max 8 min), siis vestlus (7 min):</w:t>
-      </w:r>
-    </w:p>
-    <w:tbl>
-      <w:tblPr>
-        <w:tblStyle w:val="Table"/>
-        <w:tblW w:type="auto" w:w="0"/>
-        <w:tblLook w:firstRow="1" w:lastRow="0" w:firstColumn="0" w:lastColumn="0" w:noHBand="0" w:noVBand="0" w:val="0020"/>
-        <w:jc w:val="start"/>
-      </w:tblPr>
-      <w:tblGrid>
-        <w:gridCol w:w="3960"/>
-        <w:gridCol w:w="3960"/>
-      </w:tblGrid>
-      <w:tr>
-        <w:trPr>
-          <w:tblHeader w:val="true"/>
-        </w:trPr>
-        <w:tc>
-          <w:tcPr/>
-          <w:p>
-            <w:pPr>
-              <w:pStyle w:val="Compact"/>
-              <w:jc w:val="left"/>
-            </w:pPr>
-            <w:r>
-              <w:t xml:space="preserve">Maailm</w:t>
-            </w:r>
-          </w:p>
-        </w:tc>
-        <w:tc>
-          <w:tcPr/>
-          <w:p>
-            <w:pPr>
-              <w:pStyle w:val="Compact"/>
-              <w:jc w:val="left"/>
-            </w:pPr>
-            <w:r>
-              <w:t xml:space="preserve">Inimene</w:t>
-            </w:r>
-          </w:p>
-        </w:tc>
-      </w:tr>
-      <w:tr>
-        <w:tc>
-          <w:tcPr/>
-          <w:p>
-            <w:pPr>
-              <w:pStyle w:val="Compact"/>
-              <w:jc w:val="left"/>
-            </w:pPr>
-            <w:r>
-              <w:t xml:space="preserve">~10 000 putukaliiki Eestis</w:t>
-            </w:r>
-          </w:p>
-        </w:tc>
-        <w:tc>
-          <w:tcPr/>
-          <w:p>
-            <w:pPr>
-              <w:pStyle w:val="Compact"/>
-              <w:jc w:val="left"/>
-            </w:pPr>
-            <w:r>
-              <w:t xml:space="preserve">„Kas ma olen turvaliselt koos?”</w:t>
-            </w:r>
-          </w:p>
-        </w:tc>
-      </w:tr>
-      <w:tr>
-        <w:tc>
-          <w:tcPr/>
-          <w:p>
-            <w:pPr>
-              <w:pStyle w:val="Compact"/>
-              <w:jc w:val="left"/>
-            </w:pPr>
-            <w:r>
-              <w:t xml:space="preserve">~5 500–7 000 seeneliiki</w:t>
-            </w:r>
-          </w:p>
-        </w:tc>
-        <w:tc>
-          <w:tcPr/>
-          <w:p>
-            <w:pPr>
-              <w:pStyle w:val="Compact"/>
-              <w:jc w:val="left"/>
-            </w:pPr>
-            <w:r>
-              <w:t xml:space="preserve">„Kas ma võin naerda?”</w:t>
-            </w:r>
-          </w:p>
-        </w:tc>
-      </w:tr>
-      <w:tr>
-        <w:tc>
-          <w:tcPr/>
-          <w:p>
-            <w:pPr>
-              <w:pStyle w:val="Compact"/>
-              <w:jc w:val="left"/>
-            </w:pPr>
-            <w:r>
-              <w:t xml:space="preserve">34 257+ liiki kokku</w:t>
-            </w:r>
-          </w:p>
-        </w:tc>
-        <w:tc>
-          <w:tcPr/>
-          <w:p>
-            <w:pPr>
-              <w:pStyle w:val="Compact"/>
-              <w:jc w:val="left"/>
-            </w:pPr>
-            <w:r>
-              <w:t xml:space="preserve">„Kas ma saan midagi luua?”</w:t>
-            </w:r>
-          </w:p>
-        </w:tc>
-      </w:tr>
-      <w:tr>
-        <w:tc>
-          <w:tcPr/>
-          <w:p>
-            <w:pPr>
-              <w:pStyle w:val="Compact"/>
-              <w:jc w:val="left"/>
-            </w:pPr>
-            <w:r>
-              <w:t xml:space="preserve">65 imetajat Eestis</w:t>
-            </w:r>
-          </w:p>
-        </w:tc>
-        <w:tc>
-          <w:tcPr/>
-          <w:p>
-            <w:pPr>
-              <w:pStyle w:val="Compact"/>
-              <w:jc w:val="left"/>
-            </w:pPr>
-            <w:r>
-              <w:t xml:space="preserve">„Kas keegi hoolib?”</w:t>
-            </w:r>
-          </w:p>
-        </w:tc>
-      </w:tr>
-    </w:tbl>
-    <w:p>
-      <w:pPr>
-        <w:pStyle w:val="BodyText"/>
-      </w:pPr>
-      <w:r>
-        <w:rPr>
-          <w:bCs/>
-          <w:b/>
-        </w:rPr>
-        <w:t xml:space="preserve">Oluline:</w:t>
-      </w:r>
-      <w:r>
-        <w:t xml:space="preserve"> </w:t>
-      </w:r>
-      <w:r>
-        <w:t xml:space="preserve">seened on</w:t>
-      </w:r>
-      <w:r>
-        <w:t xml:space="preserve"> </w:t>
-      </w:r>
-      <w:r>
-        <w:rPr>
-          <w:bCs/>
-          <w:b/>
-        </w:rPr>
-        <w:t xml:space="preserve">eraldi riik</w:t>
-      </w:r>
-      <w:r>
-        <w:t xml:space="preserve"> </w:t>
-      </w:r>
-      <w:r>
-        <w:t xml:space="preserve">— mitte loomariik. Putukad on loomade enamus. Meie oleme väike saar keskel ookeani.</w:t>
-      </w:r>
-    </w:p>
-    <w:p>
-      <w:pPr>
-        <w:pStyle w:val="BodyText"/>
-      </w:pPr>
-      <w:r>
-        <w:rPr>
-          <w:bCs/>
-          <w:b/>
-        </w:rPr>
-        <w:t xml:space="preserve">Vestlus küsimus (paarides, 3 min):</w:t>
-      </w:r>
-      <w:r>
-        <w:t xml:space="preserve"> </w:t>
-      </w:r>
-      <w:r>
-        <w:t xml:space="preserve">&gt;</w:t>
-      </w:r>
-      <w:r>
-        <w:t xml:space="preserve"> </w:t>
-      </w:r>
-      <w:r>
-        <w:rPr>
-          <w:iCs/>
-          <w:i/>
-        </w:rPr>
-        <w:t xml:space="preserve">„Millal sa viimati tundsid end liiga keerulise maailma all — ja mida su keha tegelikult tahtis?“</w:t>
-      </w:r>
-    </w:p>
-    <w:p>
-      <w:pPr>
-        <w:pStyle w:val="BodyText"/>
-      </w:pPr>
-      <w:r>
-        <w:rPr>
-          <w:bCs/>
-          <w:b/>
-        </w:rPr>
-        <w:t xml:space="preserve">Koolitaja kokkuvõte (1 min):</w:t>
-      </w:r>
-      <w:r>
-        <w:t xml:space="preserve"> </w:t>
-      </w:r>
-      <w:r>
-        <w:t xml:space="preserve">&gt;</w:t>
-      </w:r>
-      <w:r>
-        <w:t xml:space="preserve"> </w:t>
-      </w:r>
-      <w:r>
-        <w:rPr>
-          <w:iCs/>
-          <w:i/>
-        </w:rPr>
-        <w:t xml:space="preserve">Infosõda müüb keerukust. Imetaja aju tahab lihtsat. OPORD algab sealt.</w:t>
-      </w:r>
-    </w:p>
-    <w:p>
-      <w:pPr>
-        <w:pStyle w:val="BodyText"/>
-      </w:pPr>
-      <w:r>
-        <w:rPr>
-          <w:bCs/>
-          <w:b/>
-        </w:rPr>
-        <w:t xml:space="preserve">Viide:</w:t>
-      </w:r>
-      <w:r>
-        <w:t xml:space="preserve"> </w:t>
-      </w:r>
-      <w:r>
-        <w:t xml:space="preserve">Lisa BJ · Lisa AW</w:t>
-      </w:r>
-    </w:p>
-    <w:p>
-      <w:r>
-        <w:pict>
-          <v:rect style="width:0;height:1.5pt" o:hralign="center" o:hrstd="t" o:hr="t"/>
-        </w:pict>
-      </w:r>
-    </w:p>
-    <w:bookmarkEnd w:id="25"/>
-    <w:bookmarkStart w:id="26" w:name="faas-2-kuus-tuuma-turvalisus-2540-min"/>
-    <w:p>
-      <w:pPr>
-        <w:pStyle w:val="Heading3"/>
-      </w:pPr>
-      <w:r>
-        <w:t xml:space="preserve">Faas 2 — Kuus tuuma + turvalisus (25–40 min)</w:t>
-      </w:r>
-    </w:p>
-    <w:p>
-      <w:pPr>
-        <w:pStyle w:val="FirstParagraph"/>
-      </w:pPr>
-      <w:r>
-        <w:rPr>
-          <w:bCs/>
-          <w:b/>
-        </w:rPr>
-        <w:t xml:space="preserve">Koolitaja presenteerib tabeli (loetleb, ei loe ette slaidid):</w:t>
+        <w:t xml:space="preserve">KUUS TUUMA (koolitaja meeldetuletus)</w:t>
       </w:r>
     </w:p>
     <w:tbl>
@@ -1445,7 +1518,7 @@
               <w:jc w:val="left"/>
             </w:pPr>
             <w:r>
-              <w:t xml:space="preserve">Mida see tähendab</w:t>
+              <w:t xml:space="preserve">Üks lause</w:t>
             </w:r>
           </w:p>
         </w:tc>
@@ -1457,7 +1530,7 @@
               <w:jc w:val="left"/>
             </w:pPr>
             <w:r>
-              <w:t xml:space="preserve">OPORD</w:t>
+              <w:t xml:space="preserve">Lisa</w:t>
             </w:r>
           </w:p>
         </w:tc>
@@ -1483,10 +1556,6 @@
               <w:jc w:val="left"/>
             </w:pPr>
             <w:r>
-              <w:rPr>
-                <w:bCs/>
-                <w:b/>
-              </w:rPr>
               <w:t xml:space="preserve">Turvalisus</w:t>
             </w:r>
           </w:p>
@@ -1511,7 +1580,7 @@
               <w:jc w:val="left"/>
             </w:pPr>
             <w:r>
-              <w:t xml:space="preserve">Lisa P, I</w:t>
+              <w:t xml:space="preserve">P, I</w:t>
             </w:r>
           </w:p>
         </w:tc>
@@ -1537,10 +1606,6 @@
               <w:jc w:val="left"/>
             </w:pPr>
             <w:r>
-              <w:rPr>
-                <w:bCs/>
-                <w:b/>
-              </w:rPr>
               <w:t xml:space="preserve">Naer</w:t>
             </w:r>
           </w:p>
@@ -1553,7 +1618,7 @@
               <w:jc w:val="left"/>
             </w:pPr>
             <w:r>
-              <w:t xml:space="preserve">Koos naermine, mitte emoji</w:t>
+              <w:t xml:space="preserve">Koos naermine — Dunbar, endorfiin</w:t>
             </w:r>
           </w:p>
         </w:tc>
@@ -1565,7 +1630,7 @@
               <w:jc w:val="left"/>
             </w:pPr>
             <w:r>
-              <w:t xml:space="preserve">Lisa P, BJ</w:t>
+              <w:t xml:space="preserve">P, BJ</w:t>
             </w:r>
           </w:p>
         </w:tc>
@@ -1591,11 +1656,7 @@
               <w:jc w:val="left"/>
             </w:pPr>
             <w:r>
-              <w:rPr>
-                <w:bCs/>
-                <w:b/>
-              </w:rPr>
-              <w:t xml:space="preserve">Puudutus / intiimsus</w:t>
+              <w:t xml:space="preserve">Puudutus</w:t>
             </w:r>
           </w:p>
         </w:tc>
@@ -1619,7 +1680,7 @@
               <w:jc w:val="left"/>
             </w:pPr>
             <w:r>
-              <w:t xml:space="preserve">Lisa AA</w:t>
+              <w:t xml:space="preserve">AA</w:t>
             </w:r>
           </w:p>
         </w:tc>
@@ -1645,11 +1706,7 @@
               <w:jc w:val="left"/>
             </w:pPr>
             <w:r>
-              <w:rPr>
-                <w:bCs/>
-                <w:b/>
-              </w:rPr>
-              <w:t xml:space="preserve">Kütmine / söömine</w:t>
+              <w:t xml:space="preserve">Kütmine</w:t>
             </w:r>
           </w:p>
         </w:tc>
@@ -1673,7 +1730,7 @@
               <w:jc w:val="left"/>
             </w:pPr>
             <w:r>
-              <w:t xml:space="preserve">Lisa U, Z, BI</w:t>
+              <w:t xml:space="preserve">U, Z, BI</w:t>
             </w:r>
           </w:p>
         </w:tc>
@@ -1699,11 +1756,7 @@
               <w:jc w:val="left"/>
             </w:pPr>
             <w:r>
-              <w:rPr>
-                <w:bCs/>
-                <w:b/>
-              </w:rPr>
-              <w:t xml:space="preserve">Mäng / maadlemine</w:t>
+              <w:t xml:space="preserve">Mäng</w:t>
             </w:r>
           </w:p>
         </w:tc>
@@ -1715,7 +1768,7 @@
               <w:jc w:val="left"/>
             </w:pPr>
             <w:r>
-              <w:t xml:space="preserve">Keha, piirid, usaldus</w:t>
+              <w:t xml:space="preserve">Piirid, usaldus, keha</w:t>
             </w:r>
           </w:p>
         </w:tc>
@@ -1727,7 +1780,7 @@
               <w:jc w:val="left"/>
             </w:pPr>
             <w:r>
-              <w:t xml:space="preserve">Lisa AB, N</w:t>
+              <w:t xml:space="preserve">AB, N</w:t>
             </w:r>
           </w:p>
         </w:tc>
@@ -1753,10 +1806,6 @@
               <w:jc w:val="left"/>
             </w:pPr>
             <w:r>
-              <w:rPr>
-                <w:bCs/>
-                <w:b/>
-              </w:rPr>
               <w:t xml:space="preserve">Looming</w:t>
             </w:r>
           </w:p>
@@ -1781,126 +1830,12 @@
               <w:jc w:val="left"/>
             </w:pPr>
             <w:r>
-              <w:t xml:space="preserve">Lisa AD, BI</w:t>
+              <w:t xml:space="preserve">AD, BI</w:t>
             </w:r>
           </w:p>
         </w:tc>
       </w:tr>
     </w:tbl>
-    <w:p>
-      <w:pPr>
-        <w:pStyle w:val="BodyText"/>
-      </w:pPr>
-      <w:r>
-        <w:rPr>
-          <w:bCs/>
-          <w:b/>
-        </w:rPr>
-        <w:t xml:space="preserve">Harjutus „Peanut beliefs” (5 min)</w:t>
-      </w:r>
-      <w:r>
-        <w:t xml:space="preserve"> </w:t>
-      </w:r>
-      <w:r>
-        <w:t xml:space="preserve">— Nick Sarnicola mõte, lihtsustatult:</w:t>
-      </w:r>
-      <w:r>
-        <w:t xml:space="preserve"> </w:t>
-      </w:r>
-      <w:r>
-        <w:t xml:space="preserve">- Kirjuta üks uskumus, mis sind piirab („ma ei saa…</w:t>
-      </w:r>
-      <w:r>
-        <w:t xml:space="preserve">“</w:t>
-      </w:r>
-      <w:r>
-        <w:t xml:space="preserve">, „inimesed on…</w:t>
-      </w:r>
-      <w:r>
-        <w:t xml:space="preserve">”</w:t>
-      </w:r>
-      <w:r>
-        <w:t xml:space="preserve">)</w:t>
-      </w:r>
-      <w:r>
-        <w:t xml:space="preserve"> </w:t>
-      </w:r>
-      <w:r>
-        <w:t xml:space="preserve">- Küsi:</w:t>
-      </w:r>
-      <w:r>
-        <w:t xml:space="preserve"> </w:t>
-      </w:r>
-      <w:r>
-        <w:rPr>
-          <w:iCs/>
-          <w:i/>
-        </w:rPr>
-        <w:t xml:space="preserve">„Kas see on tõde — või maapähkel, mille keegi mulle andis?“</w:t>
-      </w:r>
-      <w:r>
-        <w:t xml:space="preserve"> </w:t>
-      </w:r>
-      <w:r>
-        <w:t xml:space="preserve">- Ära usu esimest mõtet (Lisa AW). Usu keha.</w:t>
-      </w:r>
-    </w:p>
-    <w:p>
-      <w:pPr>
-        <w:pStyle w:val="BodyText"/>
-      </w:pPr>
-      <w:r>
-        <w:rPr>
-          <w:bCs/>
-          <w:b/>
-        </w:rPr>
-        <w:t xml:space="preserve">Paaride vestlus (5 min):</w:t>
-      </w:r>
-      <w:r>
-        <w:t xml:space="preserve"> </w:t>
-      </w:r>
-      <w:r>
-        <w:t xml:space="preserve">&gt;</w:t>
-      </w:r>
-      <w:r>
-        <w:t xml:space="preserve"> </w:t>
-      </w:r>
-      <w:r>
-        <w:rPr>
-          <w:iCs/>
-          <w:i/>
-        </w:rPr>
-        <w:t xml:space="preserve">„Milline neist kuuest on sul täna tühi — ja mis juhtus, kui see tühi jäi?“</w:t>
-      </w:r>
-    </w:p>
-    <w:p>
-      <w:pPr>
-        <w:pStyle w:val="BodyText"/>
-      </w:pPr>
-      <w:r>
-        <w:rPr>
-          <w:bCs/>
-          <w:b/>
-        </w:rPr>
-        <w:t xml:space="preserve">Koolitaja hoiatus (1 min):</w:t>
-      </w:r>
-      <w:r>
-        <w:t xml:space="preserve"> </w:t>
-      </w:r>
-      <w:r>
-        <w:t xml:space="preserve">&gt;</w:t>
-      </w:r>
-      <w:r>
-        <w:t xml:space="preserve"> </w:t>
-      </w:r>
-      <w:r>
-        <w:rPr>
-          <w:iCs/>
-          <w:i/>
-        </w:rPr>
-        <w:t xml:space="preserve">Puudutus ja intiimsus — ainult nõusolekuga. Trauma olekus ei sunni vestlust. Lisa P enne kasvu (Lisa BH).</w:t>
-      </w:r>
-    </w:p>
     <w:p>
       <w:r>
         <w:pict>
@@ -1908,1091 +1843,14 @@
         </w:pict>
       </w:r>
     </w:p>
-    <w:bookmarkEnd w:id="26"/>
-    <w:bookmarkStart w:id="30" w:name="X3145ad856391cbe17548fe58e7ce4a8b331283b"/>
-    <w:p>
-      <w:pPr>
-        <w:pStyle w:val="Heading3"/>
-      </w:pPr>
-      <w:r>
-        <w:t xml:space="preserve">Faas 3 — Praktika: kehas, mitte peas (40–55 min)</w:t>
-      </w:r>
-    </w:p>
-    <w:p>
-      <w:pPr>
-        <w:pStyle w:val="FirstParagraph"/>
-      </w:pPr>
-      <w:r>
-        <w:rPr>
-          <w:bCs/>
-          <w:b/>
-        </w:rPr>
-        <w:t xml:space="preserve">Jaga osalejad 3 rühma. Iga rühm 5 min, siis vahetus. Kõik proovivad kõiki.</w:t>
-      </w:r>
-    </w:p>
-    <w:bookmarkStart w:id="27" w:name="rühm-a-kütmine-lisa-u-bi"/>
-    <w:p>
-      <w:pPr>
-        <w:pStyle w:val="Heading4"/>
-      </w:pPr>
-      <w:r>
-        <w:t xml:space="preserve">Rühm A — Kütmine (Lisa U, BI)</w:t>
-      </w:r>
-    </w:p>
-    <w:tbl>
-      <w:tblPr>
-        <w:tblStyle w:val="Table"/>
-        <w:tblW w:type="pct" w:w="5000"/>
-        <w:tblLook w:firstRow="1" w:lastRow="0" w:firstColumn="0" w:lastColumn="0" w:noHBand="0" w:noVBand="0" w:val="0020"/>
-        <w:jc w:val="start"/>
-      </w:tblPr>
-      <w:tblGrid>
-        <w:gridCol w:w="3168"/>
-        <w:gridCol w:w="4752"/>
-      </w:tblGrid>
-      <w:tr>
-        <w:trPr>
-          <w:tblHeader w:val="true"/>
-        </w:trPr>
-        <w:tc>
-          <w:tcPr/>
-          <w:p>
-            <w:pPr>
-              <w:pStyle w:val="Compact"/>
-              <w:jc w:val="left"/>
-            </w:pPr>
-            <w:r>
-              <w:t xml:space="preserve">Samm</w:t>
-            </w:r>
-          </w:p>
-        </w:tc>
-        <w:tc>
-          <w:tcPr/>
-          <w:p>
-            <w:pPr>
-              <w:pStyle w:val="Compact"/>
-              <w:jc w:val="left"/>
-            </w:pPr>
-            <w:r>
-              <w:t xml:space="preserve">Tegevus</w:t>
-            </w:r>
-          </w:p>
-        </w:tc>
-      </w:tr>
-      <w:tr>
-        <w:tc>
-          <w:tcPr/>
-          <w:p>
-            <w:pPr>
-              <w:pStyle w:val="Compact"/>
-              <w:jc w:val="left"/>
-            </w:pPr>
-            <w:r>
-              <w:t xml:space="preserve">1</w:t>
-            </w:r>
-          </w:p>
-        </w:tc>
-        <w:tc>
-          <w:tcPr/>
-          <w:p>
-            <w:pPr>
-              <w:pStyle w:val="Compact"/>
-              <w:jc w:val="left"/>
-            </w:pPr>
-            <w:r>
-              <w:t xml:space="preserve">Üks inimene valmistab lihtsa asja (tee, võileib, supp — mis on olemas)</w:t>
-            </w:r>
-          </w:p>
-        </w:tc>
-      </w:tr>
-      <w:tr>
-        <w:tc>
-          <w:tcPr/>
-          <w:p>
-            <w:pPr>
-              <w:pStyle w:val="Compact"/>
-              <w:jc w:val="left"/>
-            </w:pPr>
-            <w:r>
-              <w:t xml:space="preserve">2</w:t>
-            </w:r>
-          </w:p>
-        </w:tc>
-        <w:tc>
-          <w:tcPr/>
-          <w:p>
-            <w:pPr>
-              <w:pStyle w:val="Compact"/>
-              <w:jc w:val="left"/>
-            </w:pPr>
-            <w:r>
-              <w:t xml:space="preserve">Teised aitavad: lõikamine, segamine, serveerimine</w:t>
-            </w:r>
-          </w:p>
-        </w:tc>
-      </w:tr>
-      <w:tr>
-        <w:tc>
-          <w:tcPr/>
-          <w:p>
-            <w:pPr>
-              <w:pStyle w:val="Compact"/>
-              <w:jc w:val="left"/>
-            </w:pPr>
-            <w:r>
-              <w:t xml:space="preserve">3</w:t>
-            </w:r>
-          </w:p>
-        </w:tc>
-        <w:tc>
-          <w:tcPr/>
-          <w:p>
-            <w:pPr>
-              <w:pStyle w:val="Compact"/>
-              <w:jc w:val="left"/>
-            </w:pPr>
-            <w:r>
-              <w:t xml:space="preserve">Enne söömist:</w:t>
-            </w:r>
-            <w:r>
-              <w:t xml:space="preserve"> </w:t>
-            </w:r>
-            <w:r>
-              <w:rPr>
-                <w:iCs/>
-                <w:i/>
-              </w:rPr>
-              <w:t xml:space="preserve">„Kellele ma täna hoolin?“</w:t>
-            </w:r>
-            <w:r>
-              <w:t xml:space="preserve"> </w:t>
-            </w:r>
-            <w:r>
-              <w:t xml:space="preserve">— üks lause</w:t>
-            </w:r>
-          </w:p>
-        </w:tc>
-      </w:tr>
-    </w:tbl>
-    <w:p>
-      <w:pPr>
-        <w:pStyle w:val="BodyText"/>
-      </w:pPr>
-      <w:r>
-        <w:rPr>
-          <w:bCs/>
-          <w:b/>
-        </w:rPr>
-        <w:t xml:space="preserve">Mõte:</w:t>
-      </w:r>
-      <w:r>
-        <w:t xml:space="preserve"> </w:t>
-      </w:r>
-      <w:r>
-        <w:t xml:space="preserve">kütmine ei ole toit. Kütmine on</w:t>
-      </w:r>
-      <w:r>
-        <w:t xml:space="preserve"> </w:t>
-      </w:r>
-      <w:r>
-        <w:rPr>
-          <w:bCs/>
-          <w:b/>
-        </w:rPr>
-        <w:t xml:space="preserve">hoolitsus</w:t>
-      </w:r>
-      <w:r>
-        <w:t xml:space="preserve">.</w:t>
-      </w:r>
-    </w:p>
-    <w:bookmarkEnd w:id="27"/>
-    <w:bookmarkStart w:id="28" w:name="rühm-b-naer-lisa-bj-p"/>
-    <w:p>
-      <w:pPr>
-        <w:pStyle w:val="Heading4"/>
-      </w:pPr>
-      <w:r>
-        <w:t xml:space="preserve">Rühm B — Naer (Lisa BJ, P)</w:t>
-      </w:r>
-    </w:p>
-    <w:tbl>
-      <w:tblPr>
-        <w:tblStyle w:val="Table"/>
-        <w:tblW w:type="pct" w:w="5000"/>
-        <w:tblLook w:firstRow="1" w:lastRow="0" w:firstColumn="0" w:lastColumn="0" w:noHBand="0" w:noVBand="0" w:val="0020"/>
-        <w:jc w:val="start"/>
-      </w:tblPr>
-      <w:tblGrid>
-        <w:gridCol w:w="3168"/>
-        <w:gridCol w:w="4752"/>
-      </w:tblGrid>
-      <w:tr>
-        <w:trPr>
-          <w:tblHeader w:val="true"/>
-        </w:trPr>
-        <w:tc>
-          <w:tcPr/>
-          <w:p>
-            <w:pPr>
-              <w:pStyle w:val="Compact"/>
-              <w:jc w:val="left"/>
-            </w:pPr>
-            <w:r>
-              <w:t xml:space="preserve">Samm</w:t>
-            </w:r>
-          </w:p>
-        </w:tc>
-        <w:tc>
-          <w:tcPr/>
-          <w:p>
-            <w:pPr>
-              <w:pStyle w:val="Compact"/>
-              <w:jc w:val="left"/>
-            </w:pPr>
-            <w:r>
-              <w:t xml:space="preserve">Tegevus</w:t>
-            </w:r>
-          </w:p>
-        </w:tc>
-      </w:tr>
-      <w:tr>
-        <w:tc>
-          <w:tcPr/>
-          <w:p>
-            <w:pPr>
-              <w:pStyle w:val="Compact"/>
-              <w:jc w:val="left"/>
-            </w:pPr>
-            <w:r>
-              <w:t xml:space="preserve">1</w:t>
-            </w:r>
-          </w:p>
-        </w:tc>
-        <w:tc>
-          <w:tcPr/>
-          <w:p>
-            <w:pPr>
-              <w:pStyle w:val="Compact"/>
-              <w:jc w:val="left"/>
-            </w:pPr>
-            <w:r>
-              <w:t xml:space="preserve">Seisa ringis</w:t>
-            </w:r>
-          </w:p>
-        </w:tc>
-      </w:tr>
-      <w:tr>
-        <w:tc>
-          <w:tcPr/>
-          <w:p>
-            <w:pPr>
-              <w:pStyle w:val="Compact"/>
-              <w:jc w:val="left"/>
-            </w:pPr>
-            <w:r>
-              <w:t xml:space="preserve">2</w:t>
-            </w:r>
-          </w:p>
-        </w:tc>
-        <w:tc>
-          <w:tcPr/>
-          <w:p>
-            <w:pPr>
-              <w:pStyle w:val="Compact"/>
-              <w:jc w:val="left"/>
-            </w:pPr>
-            <w:r>
-              <w:t xml:space="preserve">Mäng: „Ei naera” — keegi teeb nalja, teised proovivad mitte naerda (10 sek)</w:t>
-            </w:r>
-          </w:p>
-        </w:tc>
-      </w:tr>
-      <w:tr>
-        <w:tc>
-          <w:tcPr/>
-          <w:p>
-            <w:pPr>
-              <w:pStyle w:val="Compact"/>
-              <w:jc w:val="left"/>
-            </w:pPr>
-            <w:r>
-              <w:t xml:space="preserve">3</w:t>
-            </w:r>
-          </w:p>
-        </w:tc>
-        <w:tc>
-          <w:tcPr/>
-          <w:p>
-            <w:pPr>
-              <w:pStyle w:val="Compact"/>
-              <w:jc w:val="left"/>
-            </w:pPr>
-            <w:r>
-              <w:t xml:space="preserve">Lase naerul tulla. Märka: keha muutub.</w:t>
-            </w:r>
-          </w:p>
-        </w:tc>
-      </w:tr>
-    </w:tbl>
-    <w:p>
-      <w:pPr>
-        <w:pStyle w:val="BodyText"/>
-      </w:pPr>
-      <w:r>
-        <w:rPr>
-          <w:bCs/>
-          <w:b/>
-        </w:rPr>
-        <w:t xml:space="preserve">Teadus (üks lause):</w:t>
-      </w:r>
-      <w:r>
-        <w:t xml:space="preserve"> </w:t>
-      </w:r>
-      <w:r>
-        <w:t xml:space="preserve">Dunbar — naer on „vokaalne pööramine”, endorfiin, rühma side.</w:t>
-      </w:r>
-    </w:p>
-    <w:bookmarkEnd w:id="28"/>
-    <w:bookmarkStart w:id="29" w:name="rühm-c-liikumine-mäng-lisa-ab"/>
-    <w:p>
-      <w:pPr>
-        <w:pStyle w:val="Heading4"/>
-      </w:pPr>
-      <w:r>
-        <w:t xml:space="preserve">Rühm C — Liikumine / mäng (Lisa AB)</w:t>
-      </w:r>
-    </w:p>
-    <w:tbl>
-      <w:tblPr>
-        <w:tblStyle w:val="Table"/>
-        <w:tblW w:type="pct" w:w="5000"/>
-        <w:tblLook w:firstRow="1" w:lastRow="0" w:firstColumn="0" w:lastColumn="0" w:noHBand="0" w:noVBand="0" w:val="0020"/>
-        <w:jc w:val="start"/>
-      </w:tblPr>
-      <w:tblGrid>
-        <w:gridCol w:w="3168"/>
-        <w:gridCol w:w="4752"/>
-      </w:tblGrid>
-      <w:tr>
-        <w:trPr>
-          <w:tblHeader w:val="true"/>
-        </w:trPr>
-        <w:tc>
-          <w:tcPr/>
-          <w:p>
-            <w:pPr>
-              <w:pStyle w:val="Compact"/>
-              <w:jc w:val="left"/>
-            </w:pPr>
-            <w:r>
-              <w:t xml:space="preserve">Samm</w:t>
-            </w:r>
-          </w:p>
-        </w:tc>
-        <w:tc>
-          <w:tcPr/>
-          <w:p>
-            <w:pPr>
-              <w:pStyle w:val="Compact"/>
-              <w:jc w:val="left"/>
-            </w:pPr>
-            <w:r>
-              <w:t xml:space="preserve">Tegevus</w:t>
-            </w:r>
-          </w:p>
-        </w:tc>
-      </w:tr>
-      <w:tr>
-        <w:tc>
-          <w:tcPr/>
-          <w:p>
-            <w:pPr>
-              <w:pStyle w:val="Compact"/>
-              <w:jc w:val="left"/>
-            </w:pPr>
-            <w:r>
-              <w:t xml:space="preserve">1</w:t>
-            </w:r>
-          </w:p>
-        </w:tc>
-        <w:tc>
-          <w:tcPr/>
-          <w:p>
-            <w:pPr>
-              <w:pStyle w:val="Compact"/>
-              <w:jc w:val="left"/>
-            </w:pPr>
-            <w:r>
-              <w:t xml:space="preserve">Timer 90 sek — rippumine (kui võimalik) või kükid / plank</w:t>
-            </w:r>
-          </w:p>
-        </w:tc>
-      </w:tr>
-      <w:tr>
-        <w:tc>
-          <w:tcPr/>
-          <w:p>
-            <w:pPr>
-              <w:pStyle w:val="Compact"/>
-              <w:jc w:val="left"/>
-            </w:pPr>
-            <w:r>
-              <w:t xml:space="preserve">2</w:t>
-            </w:r>
-          </w:p>
-        </w:tc>
-        <w:tc>
-          <w:tcPr/>
-          <w:p>
-            <w:pPr>
-              <w:pStyle w:val="Compact"/>
-              <w:jc w:val="left"/>
-            </w:pPr>
-            <w:r>
-              <w:t xml:space="preserve">Lapsed või täiskasvanud: kerge maadlemismäng (piirid, naer, mitte võitlus)</w:t>
-            </w:r>
-          </w:p>
-        </w:tc>
-      </w:tr>
-      <w:tr>
-        <w:tc>
-          <w:tcPr/>
-          <w:p>
-            <w:pPr>
-              <w:pStyle w:val="Compact"/>
-              <w:jc w:val="left"/>
-            </w:pPr>
-            <w:r>
-              <w:t xml:space="preserve">3</w:t>
-            </w:r>
-          </w:p>
-        </w:tc>
-        <w:tc>
-          <w:tcPr/>
-          <w:p>
-            <w:pPr>
-              <w:pStyle w:val="Compact"/>
-              <w:jc w:val="left"/>
-            </w:pPr>
-            <w:r>
-              <w:t xml:space="preserve">Küsige:</w:t>
-            </w:r>
-            <w:r>
-              <w:t xml:space="preserve"> </w:t>
-            </w:r>
-            <w:r>
-              <w:rPr>
-                <w:iCs/>
-                <w:i/>
-              </w:rPr>
-              <w:t xml:space="preserve">„Kuidas su keha pärast erineb?“</w:t>
-            </w:r>
-          </w:p>
-        </w:tc>
-      </w:tr>
-    </w:tbl>
-    <w:p>
-      <w:pPr>
-        <w:pStyle w:val="BodyText"/>
-      </w:pPr>
-      <w:r>
-        <w:rPr>
-          <w:bCs/>
-          <w:b/>
-        </w:rPr>
-        <w:t xml:space="preserve">Koolitaja:</w:t>
-      </w:r>
-      <w:r>
-        <w:t xml:space="preserve"> </w:t>
-      </w:r>
-      <w:r>
-        <w:t xml:space="preserve">15 min kokku. Tagasi ringi. Üks sõna kehast igaühelt.</w:t>
-      </w:r>
-    </w:p>
-    <w:p>
-      <w:r>
-        <w:pict>
-          <v:rect style="width:0;height:1.5pt" o:hralign="center" o:hrstd="t" o:hr="t"/>
-        </w:pict>
-      </w:r>
-    </w:p>
-    <w:bookmarkEnd w:id="29"/>
-    <w:bookmarkEnd w:id="30"/>
-    <w:bookmarkStart w:id="31" w:name="faas-4-kogukond-90-päeva-plaan-5570-min"/>
-    <w:p>
-      <w:pPr>
-        <w:pStyle w:val="Heading3"/>
-      </w:pPr>
-      <w:r>
-        <w:t xml:space="preserve">Faas 4 — Kogukond: 90 päeva plaan (55–70 min)</w:t>
-      </w:r>
-    </w:p>
-    <w:p>
-      <w:pPr>
-        <w:pStyle w:val="FirstParagraph"/>
-      </w:pPr>
-      <w:r>
-        <w:rPr>
-          <w:bCs/>
-          <w:b/>
-        </w:rPr>
-        <w:t xml:space="preserve">Koolitaja tutvustab Lisa BI viis mudelit (5 min):</w:t>
-      </w:r>
-    </w:p>
-    <w:p>
-      <w:pPr>
-        <w:numPr>
-          <w:ilvl w:val="0"/>
-          <w:numId w:val="1002"/>
-        </w:numPr>
-        <w:pStyle w:val="Compact"/>
-      </w:pPr>
-      <w:r>
-        <w:t xml:space="preserve">Kohaliku ruumi kaasamine</w:t>
-      </w:r>
-      <w:r>
-        <w:br/>
-      </w:r>
-    </w:p>
-    <w:p>
-      <w:pPr>
-        <w:numPr>
-          <w:ilvl w:val="0"/>
-          <w:numId w:val="1002"/>
-        </w:numPr>
-        <w:pStyle w:val="Compact"/>
-      </w:pPr>
-      <w:r>
-        <w:t xml:space="preserve">Ühine tegevus (talgud)</w:t>
-      </w:r>
-      <w:r>
-        <w:br/>
-      </w:r>
-    </w:p>
-    <w:p>
-      <w:pPr>
-        <w:numPr>
-          <w:ilvl w:val="0"/>
-          <w:numId w:val="1002"/>
-        </w:numPr>
-        <w:pStyle w:val="Compact"/>
-      </w:pPr>
-      <w:r>
-        <w:t xml:space="preserve">Kolmas koht</w:t>
-      </w:r>
-      <w:r>
-        <w:br/>
-      </w:r>
-    </w:p>
-    <w:p>
-      <w:pPr>
-        <w:numPr>
-          <w:ilvl w:val="0"/>
-          <w:numId w:val="1002"/>
-        </w:numPr>
-        <w:pStyle w:val="Compact"/>
-      </w:pPr>
-      <w:r>
-        <w:t xml:space="preserve">Ühine ressurss</w:t>
-      </w:r>
-      <w:r>
-        <w:br/>
-      </w:r>
-    </w:p>
-    <w:p>
-      <w:pPr>
-        <w:numPr>
-          <w:ilvl w:val="0"/>
-          <w:numId w:val="1002"/>
-        </w:numPr>
-        <w:pStyle w:val="Compact"/>
-      </w:pPr>
-      <w:r>
-        <w:t xml:space="preserve">Rituaal ja korduvus</w:t>
-      </w:r>
-    </w:p>
-    <w:p>
-      <w:pPr>
-        <w:pStyle w:val="FirstParagraph"/>
-      </w:pPr>
-      <w:r>
-        <w:rPr>
-          <w:bCs/>
-          <w:b/>
-        </w:rPr>
-        <w:t xml:space="preserve">Iseseisev töö (7 min):</w:t>
-      </w:r>
-      <w:r>
-        <w:t xml:space="preserve"> </w:t>
-      </w:r>
-      <w:r>
-        <w:t xml:space="preserve">iga osaleja täidab:</w:t>
-      </w:r>
-    </w:p>
-    <w:p>
-      <w:pPr>
-        <w:pStyle w:val="SourceCode"/>
-      </w:pPr>
-      <w:r>
-        <w:rPr>
-          <w:rStyle w:val="VerbatimChar"/>
-        </w:rPr>
-        <w:t xml:space="preserve">MINU 90 PÄEVA — ESIMENE SAMM</w:t>
-      </w:r>
-      <w:r>
-        <w:br/>
-      </w:r>
-      <w:r>
-        <w:br/>
-      </w:r>
-      <w:r>
-        <w:rPr>
-          <w:rStyle w:val="VerbatimChar"/>
-        </w:rPr>
-        <w:t xml:space="preserve">□ Räägin 5 naabriga (nimed: _______________)</w:t>
-      </w:r>
-      <w:r>
-        <w:br/>
-      </w:r>
-      <w:r>
-        <w:rPr>
-          <w:rStyle w:val="VerbatimChar"/>
-        </w:rPr>
-        <w:t xml:space="preserve">□ Leian ühe koha (õu / park / trepikoda): _______________</w:t>
-      </w:r>
-      <w:r>
-        <w:br/>
-      </w:r>
-      <w:r>
-        <w:rPr>
-          <w:rStyle w:val="VerbatimChar"/>
-        </w:rPr>
-        <w:t xml:space="preserve">□ Esimene kohtumine (kuupäev): _______________</w:t>
-      </w:r>
-      <w:r>
-        <w:br/>
-      </w:r>
-      <w:r>
-        <w:rPr>
-          <w:rStyle w:val="VerbatimChar"/>
-        </w:rPr>
-        <w:t xml:space="preserve">□ Esimene rituaal (iga nädal): _______________</w:t>
-      </w:r>
-    </w:p>
-    <w:p>
-      <w:pPr>
-        <w:pStyle w:val="FirstParagraph"/>
-      </w:pPr>
-      <w:r>
-        <w:rPr>
-          <w:bCs/>
-          <w:b/>
-        </w:rPr>
-        <w:t xml:space="preserve">Rühma jagamine (3 min):</w:t>
-      </w:r>
-      <w:r>
-        <w:t xml:space="preserve"> </w:t>
-      </w:r>
-      <w:r>
-        <w:t xml:space="preserve">loe üks rida valjusti — mis on sinu esimene samm.</w:t>
-      </w:r>
-    </w:p>
-    <w:p>
-      <w:pPr>
-        <w:pStyle w:val="BodyText"/>
-      </w:pPr>
-      <w:r>
-        <w:rPr>
-          <w:bCs/>
-          <w:b/>
-        </w:rPr>
-        <w:t xml:space="preserve">Üks lause naabrile (koolitaja annab ette):</w:t>
-      </w:r>
-      <w:r>
-        <w:t xml:space="preserve"> </w:t>
-      </w:r>
-      <w:r>
-        <w:t xml:space="preserve">&gt;</w:t>
-      </w:r>
-      <w:r>
-        <w:t xml:space="preserve"> </w:t>
-      </w:r>
-      <w:r>
-        <w:rPr>
-          <w:iCs/>
-          <w:i/>
-        </w:rPr>
-        <w:t xml:space="preserve">„Tahan, et meie kvartalis oleks koht, kus lapsed mängivad ja me räägime — kas sa oled nõus üks kord kuus kohtuma?“</w:t>
-      </w:r>
-    </w:p>
-    <w:p>
-      <w:r>
-        <w:pict>
-          <v:rect style="width:0;height:1.5pt" o:hralign="center" o:hrstd="t" o:hr="t"/>
-        </w:pict>
-      </w:r>
-    </w:p>
-    <w:bookmarkEnd w:id="31"/>
-    <w:bookmarkStart w:id="32" w:name="faas-5-refleksioon-ja-lõpetus-7090-min"/>
-    <w:p>
-      <w:pPr>
-        <w:pStyle w:val="Heading3"/>
-      </w:pPr>
-      <w:r>
-        <w:t xml:space="preserve">Faas 5 — Refleksioon ja lõpetus (70–90 min)</w:t>
-      </w:r>
-    </w:p>
-    <w:p>
-      <w:pPr>
-        <w:pStyle w:val="FirstParagraph"/>
-      </w:pPr>
-      <w:r>
-        <w:rPr>
-          <w:bCs/>
-          <w:b/>
-        </w:rPr>
-        <w:t xml:space="preserve">Ringis (10 min) — spordikommentaator (Lisa P):</w:t>
-      </w:r>
-      <w:r>
-        <w:t xml:space="preserve"> </w:t>
-      </w:r>
-      <w:r>
-        <w:t xml:space="preserve">- Igaüks ütleb</w:t>
-      </w:r>
-      <w:r>
-        <w:t xml:space="preserve"> </w:t>
-      </w:r>
-      <w:r>
-        <w:rPr>
-          <w:bCs/>
-          <w:b/>
-        </w:rPr>
-        <w:t xml:space="preserve">ühe lause</w:t>
-      </w:r>
-      <w:r>
-        <w:t xml:space="preserve">, mida ta täna nägi/tundis — mitte arvamust.</w:t>
-      </w:r>
-      <w:r>
-        <w:t xml:space="preserve"> </w:t>
-      </w:r>
-      <w:r>
-        <w:t xml:space="preserve">- Näide:</w:t>
-      </w:r>
-      <w:r>
-        <w:t xml:space="preserve"> </w:t>
-      </w:r>
-      <w:r>
-        <w:rPr>
-          <w:iCs/>
-          <w:i/>
-        </w:rPr>
-        <w:t xml:space="preserve">„Ma märkasin, et pärast naeru oli mul kergem hingata.”</w:t>
-      </w:r>
-    </w:p>
-    <w:p>
-      <w:pPr>
-        <w:pStyle w:val="BodyText"/>
-      </w:pPr>
-      <w:r>
-        <w:rPr>
-          <w:bCs/>
-          <w:b/>
-        </w:rPr>
-        <w:t xml:space="preserve">Kokkuvõte koolitajalt (3 min):</w:t>
-      </w:r>
-    </w:p>
-    <w:p>
-      <w:pPr>
-        <w:pStyle w:val="SourceCode"/>
-      </w:pPr>
-      <w:r>
-        <w:rPr>
-          <w:rStyle w:val="VerbatimChar"/>
-        </w:rPr>
-        <w:t xml:space="preserve">BIOLOOGILINE OPERATSIOONIKÄSK:</w:t>
-      </w:r>
-      <w:r>
-        <w:br/>
-      </w:r>
-      <w:r>
-        <w:br/>
-      </w:r>
-      <w:r>
-        <w:rPr>
-          <w:rStyle w:val="VerbatimChar"/>
-        </w:rPr>
-        <w:t xml:space="preserve">1. TURVALISUS  →  2. NAER  →  3. PUUDUTUS  →  4. KÜTmine</w:t>
-      </w:r>
-      <w:r>
-        <w:br/>
-      </w:r>
-      <w:r>
-        <w:rPr>
-          <w:rStyle w:val="VerbatimChar"/>
-        </w:rPr>
-        <w:t xml:space="preserve">→  5. MÄNG  →  6. LOOMING  →  7. KOGUKOND</w:t>
-      </w:r>
-      <w:r>
-        <w:br/>
-      </w:r>
-      <w:r>
-        <w:br/>
-      </w:r>
-      <w:r>
-        <w:rPr>
-          <w:rStyle w:val="VerbatimChar"/>
-        </w:rPr>
-        <w:t xml:space="preserve">Ära lase algoritmil asendada naeru, puudutust ja kätega tegemist.</w:t>
-      </w:r>
-    </w:p>
-    <w:p>
-      <w:pPr>
-        <w:pStyle w:val="FirstParagraph"/>
-      </w:pPr>
-      <w:r>
-        <w:rPr>
-          <w:bCs/>
-          <w:b/>
-        </w:rPr>
-        <w:t xml:space="preserve">Kodutöö (üks nädal):</w:t>
-      </w:r>
-      <w:r>
-        <w:t xml:space="preserve"> </w:t>
-      </w:r>
-      <w:r>
-        <w:t xml:space="preserve">- [ ] Tee üks tuum päevas (naer / liikumine / kütmine koos kellegagi / looming)</w:t>
-      </w:r>
-      <w:r>
-        <w:t xml:space="preserve"> </w:t>
-      </w:r>
-      <w:r>
-        <w:t xml:space="preserve">- [ ] Räägi ühe naabriga</w:t>
-      </w:r>
-      <w:r>
-        <w:t xml:space="preserve"> </w:t>
-      </w:r>
-      <w:r>
-        <w:t xml:space="preserve">- [ ] Loe Lisa BI või Nick Sarnicola eestikeelne kokkuvõte</w:t>
-      </w:r>
-    </w:p>
-    <w:p>
-      <w:pPr>
-        <w:pStyle w:val="BodyText"/>
-      </w:pPr>
-      <w:r>
-        <w:rPr>
-          <w:bCs/>
-          <w:b/>
-        </w:rPr>
-        <w:t xml:space="preserve">Lõpetussõna (ütle valjusti):</w:t>
-      </w:r>
-      <w:r>
-        <w:t xml:space="preserve"> </w:t>
-      </w:r>
-      <w:r>
-        <w:t xml:space="preserve">&gt;</w:t>
-      </w:r>
-      <w:r>
-        <w:t xml:space="preserve"> </w:t>
-      </w:r>
-      <w:r>
-        <w:rPr>
-          <w:iCs/>
-          <w:i/>
-        </w:rPr>
-        <w:t xml:space="preserve">„Maailm on seened ja putukad. Sina oled imetaja, kes tahab turvaliselt koos naerda. See on piisavalt lihtne.”</w:t>
-      </w:r>
-    </w:p>
-    <w:p>
-      <w:r>
-        <w:pict>
-          <v:rect style="width:0;height:1.5pt" o:hralign="center" o:hrstd="t" o:hr="t"/>
-        </w:pict>
-      </w:r>
-    </w:p>
-    <w:bookmarkEnd w:id="32"/>
-    <w:bookmarkEnd w:id="33"/>
-    <w:bookmarkStart w:id="37" w:name="koolitaja-märkused"/>
+    <w:bookmarkEnd w:id="23"/>
+    <w:bookmarkStart w:id="24" w:name="koolitaja-kui-midagi-läheb-valesti"/>
     <w:p>
       <w:pPr>
         <w:pStyle w:val="Heading2"/>
       </w:pPr>
       <w:r>
-        <w:t xml:space="preserve">4. KOOLITAJA MÄRKUSED</w:t>
-      </w:r>
-    </w:p>
-    <w:bookmarkStart w:id="34" w:name="mida-teha"/>
-    <w:p>
-      <w:pPr>
-        <w:pStyle w:val="Heading3"/>
-      </w:pPr>
-      <w:r>
-        <w:t xml:space="preserve">Mida teha</w:t>
-      </w:r>
-    </w:p>
-    <w:tbl>
-      <w:tblPr>
-        <w:tblStyle w:val="Table"/>
-        <w:tblW w:type="pct" w:w="5000"/>
-        <w:tblLook w:firstRow="1" w:lastRow="0" w:firstColumn="0" w:lastColumn="0" w:noHBand="0" w:noVBand="0" w:val="0020"/>
-        <w:jc w:val="start"/>
-      </w:tblPr>
-      <w:tblGrid>
-        <w:gridCol w:w="3960"/>
-        <w:gridCol w:w="3960"/>
-      </w:tblGrid>
-      <w:tr>
-        <w:trPr>
-          <w:tblHeader w:val="true"/>
-        </w:trPr>
-        <w:tc>
-          <w:tcPr/>
-          <w:p>
-            <w:pPr>
-              <w:pStyle w:val="Compact"/>
-              <w:jc w:val="left"/>
-            </w:pPr>
-            <w:r>
-              <w:t xml:space="preserve">Olukord</w:t>
-            </w:r>
-          </w:p>
-        </w:tc>
-        <w:tc>
-          <w:tcPr/>
-          <w:p>
-            <w:pPr>
-              <w:pStyle w:val="Compact"/>
-              <w:jc w:val="left"/>
-            </w:pPr>
-            <w:r>
-              <w:t xml:space="preserve">Tegevus</w:t>
-            </w:r>
-          </w:p>
-        </w:tc>
-      </w:tr>
-      <w:tr>
-        <w:tc>
-          <w:tcPr/>
-          <w:p>
-            <w:pPr>
-              <w:pStyle w:val="Compact"/>
-              <w:jc w:val="left"/>
-            </w:pPr>
-            <w:r>
-              <w:t xml:space="preserve">Osaleja nutab / triggeris</w:t>
-            </w:r>
-          </w:p>
-        </w:tc>
-        <w:tc>
-          <w:tcPr/>
-          <w:p>
-            <w:pPr>
-              <w:pStyle w:val="Compact"/>
-              <w:jc w:val="left"/>
-            </w:pPr>
-            <w:r>
-              <w:t xml:space="preserve">Peata grupp. Ruum. 1-1. Lisa P.</w:t>
-            </w:r>
-          </w:p>
-        </w:tc>
-      </w:tr>
-      <w:tr>
-        <w:tc>
-          <w:tcPr/>
-          <w:p>
-            <w:pPr>
-              <w:pStyle w:val="Compact"/>
-              <w:jc w:val="left"/>
-            </w:pPr>
-            <w:r>
-              <w:t xml:space="preserve">Keegi ei taha rühmas</w:t>
-            </w:r>
-          </w:p>
-        </w:tc>
-        <w:tc>
-          <w:tcPr/>
-          <w:p>
-            <w:pPr>
-              <w:pStyle w:val="Compact"/>
-              <w:jc w:val="left"/>
-            </w:pPr>
-            <w:r>
-              <w:t xml:space="preserve">Luba vaadata kõrvalt. Madal lävi.</w:t>
-            </w:r>
-          </w:p>
-        </w:tc>
-      </w:tr>
-      <w:tr>
-        <w:tc>
-          <w:tcPr/>
-          <w:p>
-            <w:pPr>
-              <w:pStyle w:val="Compact"/>
-              <w:jc w:val="left"/>
-            </w:pPr>
-            <w:r>
-              <w:t xml:space="preserve">Debatt poliitikast</w:t>
-            </w:r>
-          </w:p>
-        </w:tc>
-        <w:tc>
-          <w:tcPr/>
-          <w:p>
-            <w:pPr>
-              <w:pStyle w:val="Compact"/>
-              <w:jc w:val="left"/>
-            </w:pPr>
-            <w:r>
-              <w:t xml:space="preserve">Suuna tagasi:</w:t>
-            </w:r>
-            <w:r>
-              <w:t xml:space="preserve"> </w:t>
-            </w:r>
-            <w:r>
-              <w:rPr>
-                <w:iCs/>
-                <w:i/>
-              </w:rPr>
-              <w:t xml:space="preserve">„Mida su keha tunneb?“</w:t>
-            </w:r>
-          </w:p>
-        </w:tc>
-      </w:tr>
-      <w:tr>
-        <w:tc>
-          <w:tcPr/>
-          <w:p>
-            <w:pPr>
-              <w:pStyle w:val="Compact"/>
-              <w:jc w:val="left"/>
-            </w:pPr>
-            <w:r>
-              <w:t xml:space="preserve">Liiga palju teooriat</w:t>
-            </w:r>
-          </w:p>
-        </w:tc>
-        <w:tc>
-          <w:tcPr/>
-          <w:p>
-            <w:pPr>
-              <w:pStyle w:val="Compact"/>
-              <w:jc w:val="left"/>
-            </w:pPr>
-            <w:r>
-              <w:t xml:space="preserve">Lõika. Mine praktikasse. 40. min peab olema kehas.</w:t>
-            </w:r>
-          </w:p>
-        </w:tc>
-      </w:tr>
-    </w:tbl>
-    <w:bookmarkEnd w:id="34"/>
-    <w:bookmarkStart w:id="35" w:name="mida-mitte-teha"/>
-    <w:p>
-      <w:pPr>
-        <w:pStyle w:val="Heading3"/>
-      </w:pPr>
-      <w:r>
-        <w:t xml:space="preserve">Mida mitte teha</w:t>
+        <w:t xml:space="preserve">KOOLITAJA — KUI MIDAGI LÄHEB VALESTI</w:t>
       </w:r>
     </w:p>
     <w:tbl>
@@ -3018,7 +1876,7 @@
               <w:jc w:val="left"/>
             </w:pPr>
             <w:r>
-              <w:t xml:space="preserve">❌</w:t>
+              <w:t xml:space="preserve">Olukord</w:t>
             </w:r>
           </w:p>
         </w:tc>
@@ -3030,7 +1888,7 @@
               <w:jc w:val="left"/>
             </w:pPr>
             <w:r>
-              <w:t xml:space="preserve">✅</w:t>
+              <w:t xml:space="preserve">Tegevus</w:t>
             </w:r>
           </w:p>
         </w:tc>
@@ -3044,7 +1902,7 @@
               <w:jc w:val="left"/>
             </w:pPr>
             <w:r>
-              <w:t xml:space="preserve">Massiline intiimsusharjutus</w:t>
+              <w:t xml:space="preserve">Nutab / triggeris</w:t>
             </w:r>
           </w:p>
         </w:tc>
@@ -3056,7 +1914,7 @@
               <w:jc w:val="left"/>
             </w:pPr>
             <w:r>
-              <w:t xml:space="preserve">Aus vestlus, nõusolek</w:t>
+              <w:t xml:space="preserve">Peata. Ruum. 1-1. Lisa P.</w:t>
             </w:r>
           </w:p>
         </w:tc>
@@ -3070,7 +1928,7 @@
               <w:jc w:val="left"/>
             </w:pPr>
             <w:r>
-              <w:t xml:space="preserve">Sunni OPORD-i lugemist</w:t>
+              <w:t xml:space="preserve">Ei taha rühmas</w:t>
             </w:r>
           </w:p>
         </w:tc>
@@ -3082,7 +1940,7 @@
               <w:jc w:val="left"/>
             </w:pPr>
             <w:r>
-              <w:t xml:space="preserve">Üks lisa, üks samm</w:t>
+              <w:t xml:space="preserve">Luba kõrvalt vaadata.</w:t>
             </w:r>
           </w:p>
         </w:tc>
@@ -3096,7 +1954,7 @@
               <w:jc w:val="left"/>
             </w:pPr>
             <w:r>
-              <w:t xml:space="preserve">Kiirusta</w:t>
+              <w:t xml:space="preserve">Poliitika-debatt</w:t>
             </w:r>
           </w:p>
         </w:tc>
@@ -3108,7 +1966,11 @@
               <w:jc w:val="left"/>
             </w:pPr>
             <w:r>
-              <w:t xml:space="preserve">90 min on miinimum</w:t>
+              <w:rPr>
+                <w:iCs/>
+                <w:i/>
+              </w:rPr>
+              <w:t xml:space="preserve">„Mida su keha tunneb?“</w:t>
             </w:r>
           </w:p>
         </w:tc>
@@ -3122,7 +1984,7 @@
               <w:jc w:val="left"/>
             </w:pPr>
             <w:r>
-              <w:t xml:space="preserve">Ignoreeri trauma märke</w:t>
+              <w:t xml:space="preserve">Liiga palju teooriat</w:t>
             </w:r>
           </w:p>
         </w:tc>
@@ -3134,43 +1996,12 @@
               <w:jc w:val="left"/>
             </w:pPr>
             <w:r>
-              <w:t xml:space="preserve">Lisa H, P viited</w:t>
+              <w:t xml:space="preserve">Lõika. 40. min peab olema kehas.</w:t>
             </w:r>
           </w:p>
         </w:tc>
       </w:tr>
     </w:tbl>
-    <w:bookmarkEnd w:id="35"/>
-    <w:bookmarkStart w:id="36" w:name="v-formatsioon-lisa-i"/>
-    <w:p>
-      <w:pPr>
-        <w:pStyle w:val="Heading3"/>
-      </w:pPr>
-      <w:r>
-        <w:t xml:space="preserve">V-formatsioon (Lisa I)</w:t>
-      </w:r>
-    </w:p>
-    <w:p>
-      <w:pPr>
-        <w:pStyle w:val="FirstParagraph"/>
-      </w:pPr>
-      <w:r>
-        <w:t xml:space="preserve">Koolitaja on</w:t>
-      </w:r>
-      <w:r>
-        <w:t xml:space="preserve"> </w:t>
-      </w:r>
-      <w:r>
-        <w:rPr>
-          <w:bCs/>
-          <w:b/>
-        </w:rPr>
-        <w:t xml:space="preserve">keskel</w:t>
-      </w:r>
-      <w:r>
-        <w:t xml:space="preserve">, mitte laval. Toolid samal tasemel. Juht ei predikeeri — juht loob ruumi.</w:t>
-      </w:r>
-    </w:p>
     <w:p>
       <w:r>
         <w:pict>
@@ -3178,33 +2009,14 @@
         </w:pict>
       </w:r>
     </w:p>
-    <w:bookmarkEnd w:id="36"/>
-    <w:bookmarkEnd w:id="37"/>
-    <w:bookmarkStart w:id="38" w:name="hindamine-ja-tunnistus"/>
+    <w:bookmarkEnd w:id="24"/>
+    <w:bookmarkStart w:id="25" w:name="eneserefleksioon-ei-ole-eksam"/>
     <w:p>
       <w:pPr>
         <w:pStyle w:val="Heading2"/>
       </w:pPr>
       <w:r>
-        <w:t xml:space="preserve">5. HINDAMINE JA TUNNISTUS</w:t>
-      </w:r>
-    </w:p>
-    <w:p>
-      <w:pPr>
-        <w:pStyle w:val="FirstParagraph"/>
-      </w:pPr>
-      <w:r>
-        <w:rPr>
-          <w:bCs/>
-          <w:b/>
-        </w:rPr>
-        <w:t xml:space="preserve">See ei ole eksam.</w:t>
-      </w:r>
-      <w:r>
-        <w:t xml:space="preserve"> </w:t>
-      </w:r>
-      <w:r>
-        <w:t xml:space="preserve">Eneserefleksioon:</w:t>
+        <w:t xml:space="preserve">ENESEREFLEKSIOON (ei ole eksam)</w:t>
       </w:r>
     </w:p>
     <w:tbl>
@@ -3242,7 +2054,7 @@
               <w:jc w:val="left"/>
             </w:pPr>
             <w:r>
-              <w:t xml:space="preserve">Jah / osaliselt / ei</w:t>
+              <w:t xml:space="preserve">☐ jah ☐ osaliselt ☐ ei</w:t>
             </w:r>
           </w:p>
         </w:tc>
@@ -3256,7 +2068,7 @@
               <w:jc w:val="left"/>
             </w:pPr>
             <w:r>
-              <w:t xml:space="preserve">Kas ma nimetasin kuus tuuma?</w:t>
+              <w:t xml:space="preserve">Nimetasin kuus tuuma?</w:t>
             </w:r>
           </w:p>
         </w:tc>
@@ -3278,7 +2090,7 @@
               <w:jc w:val="left"/>
             </w:pPr>
             <w:r>
-              <w:t xml:space="preserve">Kas ma kogesin vähemalt kahte kehas?</w:t>
+              <w:t xml:space="preserve">Kogesin vähemalt kahte kehas?</w:t>
             </w:r>
           </w:p>
         </w:tc>
@@ -3300,7 +2112,7 @@
               <w:jc w:val="left"/>
             </w:pPr>
             <w:r>
-              <w:t xml:space="preserve">Kas mul on üks konkreetne samm 90 päevaks?</w:t>
+              <w:t xml:space="preserve">Mul on üks samm 90 päevaks?</w:t>
             </w:r>
           </w:p>
         </w:tc>
@@ -3322,7 +2134,7 @@
               <w:jc w:val="left"/>
             </w:pPr>
             <w:r>
-              <w:t xml:space="preserve">Kas ma tean, kellele öelda ühe lause naabrile?</w:t>
+              <w:t xml:space="preserve">Tean lause naabrile?</w:t>
             </w:r>
           </w:p>
         </w:tc>
@@ -3345,27 +2157,13 @@
           <w:bCs/>
           <w:b/>
         </w:rPr>
-        <w:t xml:space="preserve">Tunnistus (valikuline, allkirjaga):</w:t>
-      </w:r>
-    </w:p>
-    <w:p>
-      <w:pPr>
-        <w:pStyle w:val="BlockText"/>
-      </w:pPr>
-      <w:r>
-        <w:t xml:space="preserve">Mina, _______________, osalesin KK1 koolitusel „Inimlik tuum”.</w:t>
+        <w:t xml:space="preserve">Tunnistus (valikuline):</w:t>
       </w:r>
       <w:r>
-        <w:br/>
+        <w:t xml:space="preserve"> </w:t>
       </w:r>
       <w:r>
-        <w:t xml:space="preserve">Kohustun ühe nädala jooksul tegema ühe sammu kogukonna või tuuma suunas.</w:t>
-      </w:r>
-      <w:r>
-        <w:br/>
-      </w:r>
-      <w:r>
-        <w:t xml:space="preserve">Kuupäev: _______________ Allkiri: _______________</w:t>
+        <w:t xml:space="preserve">Mina, __________, osalesin KK1 „Inimlik tuum”. Kohustun ühe nädala jooksul tegema ühe sammu. Kuupäev: ______ Allkiri: ______</w:t>
       </w:r>
     </w:p>
     <w:p>
@@ -3375,14 +2173,14 @@
         </w:pict>
       </w:r>
     </w:p>
-    <w:bookmarkEnd w:id="38"/>
-    <w:bookmarkStart w:id="39" w:name="materjalide-nimekiri"/>
+    <w:bookmarkEnd w:id="25"/>
+    <w:bookmarkStart w:id="26" w:name="materjalid"/>
     <w:p>
       <w:pPr>
         <w:pStyle w:val="Heading2"/>
       </w:pPr>
       <w:r>
-        <w:t xml:space="preserve">6. MATERJALIDE NIMEKIRI</w:t>
+        <w:t xml:space="preserve">MATERJALID</w:t>
       </w:r>
     </w:p>
     <w:tbl>
@@ -3393,9 +2191,8 @@
         <w:jc w:val="start"/>
       </w:tblPr>
       <w:tblGrid>
-        <w:gridCol w:w="1250"/>
-        <w:gridCol w:w="4168"/>
-        <w:gridCol w:w="2501"/>
+        <w:gridCol w:w="2970"/>
+        <w:gridCol w:w="4950"/>
       </w:tblGrid>
       <w:tr>
         <w:trPr>
@@ -3409,7 +2206,7 @@
               <w:jc w:val="left"/>
             </w:pPr>
             <w:r>
-              <w:t xml:space="preserve">#</w:t>
+              <w:t xml:space="preserve">Fail</w:t>
             </w:r>
           </w:p>
         </w:tc>
@@ -3421,19 +2218,7 @@
               <w:jc w:val="left"/>
             </w:pPr>
             <w:r>
-              <w:t xml:space="preserve">Materjal</w:t>
-            </w:r>
-          </w:p>
-        </w:tc>
-        <w:tc>
-          <w:tcPr/>
-          <w:p>
-            <w:pPr>
-              <w:pStyle w:val="Compact"/>
-              <w:jc w:val="left"/>
-            </w:pPr>
-            <w:r>
-              <w:t xml:space="preserve">Kust</w:t>
+              <w:t xml:space="preserve">Otstarve</w:t>
             </w:r>
           </w:p>
         </w:tc>
@@ -3447,7 +2232,10 @@
               <w:jc w:val="left"/>
             </w:pPr>
             <w:r>
-              <w:t xml:space="preserve">1</w:t>
+              <w:rPr>
+                <w:rStyle w:val="VerbatimChar"/>
+              </w:rPr>
+              <w:t xml:space="preserve">opord/kursid/KK1-inimlik-tuum-koolituskaart.md</w:t>
             </w:r>
           </w:p>
         </w:tc>
@@ -3459,22 +2247,7 @@
               <w:jc w:val="left"/>
             </w:pPr>
             <w:r>
-              <w:t xml:space="preserve">See koolituskaart</w:t>
-            </w:r>
-          </w:p>
-        </w:tc>
-        <w:tc>
-          <w:tcPr/>
-          <w:p>
-            <w:pPr>
-              <w:pStyle w:val="Compact"/>
-              <w:jc w:val="left"/>
-            </w:pPr>
-            <w:r>
-              <w:rPr>
-                <w:rStyle w:val="VerbatimChar"/>
-              </w:rPr>
-              <w:t xml:space="preserve">opord/kursid/KK1-inimlik-tuum-koolituskaart.md</w:t>
+              <w:t xml:space="preserve">See kaart</w:t>
             </w:r>
           </w:p>
         </w:tc>
@@ -3488,7 +2261,10 @@
               <w:jc w:val="left"/>
             </w:pPr>
             <w:r>
-              <w:t xml:space="preserve">2</w:t>
+              <w:rPr>
+                <w:rStyle w:val="VerbatimChar"/>
+              </w:rPr>
+              <w:t xml:space="preserve">opord/lisad/lisa-p-takistused-ja-valideerimine.md</w:t>
             </w:r>
           </w:p>
         </w:tc>
@@ -3500,22 +2276,7 @@
               <w:jc w:val="left"/>
             </w:pPr>
             <w:r>
-              <w:t xml:space="preserve">Lisa P — turvalisus</w:t>
-            </w:r>
-          </w:p>
-        </w:tc>
-        <w:tc>
-          <w:tcPr/>
-          <w:p>
-            <w:pPr>
-              <w:pStyle w:val="Compact"/>
-              <w:jc w:val="left"/>
-            </w:pPr>
-            <w:r>
-              <w:rPr>
-                <w:rStyle w:val="VerbatimChar"/>
-              </w:rPr>
-              <w:t xml:space="preserve">opord/lisad/lisa-p-takistused-ja-valideerimine.md</w:t>
+              <w:t xml:space="preserve">Turvalisus</w:t>
             </w:r>
           </w:p>
         </w:tc>
@@ -3529,7 +2290,10 @@
               <w:jc w:val="left"/>
             </w:pPr>
             <w:r>
-              <w:t xml:space="preserve">3</w:t>
+              <w:rPr>
+                <w:rStyle w:val="VerbatimChar"/>
+              </w:rPr>
+              <w:t xml:space="preserve">opord/lisad/lisa-bi-kogukond-tallinnas.md</w:t>
             </w:r>
           </w:p>
         </w:tc>
@@ -3541,22 +2305,7 @@
               <w:jc w:val="left"/>
             </w:pPr>
             <w:r>
-              <w:t xml:space="preserve">Lisa BI — kogukond</w:t>
-            </w:r>
-          </w:p>
-        </w:tc>
-        <w:tc>
-          <w:tcPr/>
-          <w:p>
-            <w:pPr>
-              <w:pStyle w:val="Compact"/>
-              <w:jc w:val="left"/>
-            </w:pPr>
-            <w:r>
-              <w:rPr>
-                <w:rStyle w:val="VerbatimChar"/>
-              </w:rPr>
-              <w:t xml:space="preserve">opord/lisad/lisa-bi-kogukond-tallinnas.md</w:t>
+              <w:t xml:space="preserve">Kogukond</w:t>
             </w:r>
           </w:p>
         </w:tc>
@@ -3570,7 +2319,10 @@
               <w:jc w:val="left"/>
             </w:pPr>
             <w:r>
-              <w:t xml:space="preserve">4</w:t>
+              <w:rPr>
+                <w:rStyle w:val="VerbatimChar"/>
+              </w:rPr>
+              <w:t xml:space="preserve">opord/lisad/lisa-bj-loomariik-aju-ja-inimlik-tuum.md</w:t>
             </w:r>
           </w:p>
         </w:tc>
@@ -3582,22 +2334,7 @@
               <w:jc w:val="left"/>
             </w:pPr>
             <w:r>
-              <w:t xml:space="preserve">Lisa BJ — loomariik</w:t>
-            </w:r>
-          </w:p>
-        </w:tc>
-        <w:tc>
-          <w:tcPr/>
-          <w:p>
-            <w:pPr>
-              <w:pStyle w:val="Compact"/>
-              <w:jc w:val="left"/>
-            </w:pPr>
-            <w:r>
-              <w:rPr>
-                <w:rStyle w:val="VerbatimChar"/>
-              </w:rPr>
-              <w:t xml:space="preserve">opord/lisad/lisa-bj-loomariik-aju-ja-inimlik-tuum.md</w:t>
+              <w:t xml:space="preserve">Loomariik, aju lihtsus</w:t>
             </w:r>
           </w:p>
         </w:tc>
@@ -3611,7 +2348,10 @@
               <w:jc w:val="left"/>
             </w:pPr>
             <w:r>
-              <w:t xml:space="preserve">5</w:t>
+              <w:rPr>
+                <w:rStyle w:val="VerbatimChar"/>
+              </w:rPr>
+              <w:t xml:space="preserve">Nick_Sarnicola_Ettevotja_Motteviis_EST.md</w:t>
             </w:r>
           </w:p>
         </w:tc>
@@ -3623,186 +2363,12 @@
               <w:jc w:val="left"/>
             </w:pPr>
             <w:r>
-              <w:t xml:space="preserve">Nick Sarnicola ET</w:t>
-            </w:r>
-          </w:p>
-        </w:tc>
-        <w:tc>
-          <w:tcPr/>
-          <w:p>
-            <w:pPr>
-              <w:pStyle w:val="Compact"/>
-              <w:jc w:val="left"/>
-            </w:pPr>
-            <w:r>
-              <w:rPr>
-                <w:rStyle w:val="VerbatimChar"/>
-              </w:rPr>
-              <w:t xml:space="preserve">Nick_Sarnicola_Ettevotja_Motteviis_EST.md</w:t>
-            </w:r>
-          </w:p>
-        </w:tc>
-      </w:tr>
-      <w:tr>
-        <w:tc>
-          <w:tcPr/>
-          <w:p>
-            <w:pPr>
-              <w:pStyle w:val="Compact"/>
-              <w:jc w:val="left"/>
-            </w:pPr>
-            <w:r>
-              <w:t xml:space="preserve">6</w:t>
-            </w:r>
-          </w:p>
-        </w:tc>
-        <w:tc>
-          <w:tcPr/>
-          <w:p>
-            <w:pPr>
-              <w:pStyle w:val="Compact"/>
-              <w:jc w:val="left"/>
-            </w:pPr>
-            <w:r>
-              <w:t xml:space="preserve">Pliiats, paber</w:t>
-            </w:r>
-          </w:p>
-        </w:tc>
-        <w:tc>
-          <w:tcPr/>
-          <w:p>
-            <w:pPr>
-              <w:pStyle w:val="Compact"/>
-              <w:jc w:val="left"/>
-            </w:pPr>
-            <w:r>
-              <w:t xml:space="preserve">Kohapeal</w:t>
-            </w:r>
-          </w:p>
-        </w:tc>
-      </w:tr>
-      <w:tr>
-        <w:tc>
-          <w:tcPr/>
-          <w:p>
-            <w:pPr>
-              <w:pStyle w:val="Compact"/>
-              <w:jc w:val="left"/>
-            </w:pPr>
-            <w:r>
-              <w:t xml:space="preserve">7</w:t>
-            </w:r>
-          </w:p>
-        </w:tc>
-        <w:tc>
-          <w:tcPr/>
-          <w:p>
-            <w:pPr>
-              <w:pStyle w:val="Compact"/>
-              <w:jc w:val="left"/>
-            </w:pPr>
-            <w:r>
-              <w:t xml:space="preserve">Lihtne toit / tee</w:t>
-            </w:r>
-          </w:p>
-        </w:tc>
-        <w:tc>
-          <w:tcPr/>
-          <w:p>
-            <w:pPr>
-              <w:pStyle w:val="Compact"/>
-              <w:jc w:val="left"/>
-            </w:pPr>
-            <w:r>
-              <w:t xml:space="preserve">Kohapeal</w:t>
-            </w:r>
-          </w:p>
-        </w:tc>
-      </w:tr>
-      <w:tr>
-        <w:tc>
-          <w:tcPr/>
-          <w:p>
-            <w:pPr>
-              <w:pStyle w:val="Compact"/>
-              <w:jc w:val="left"/>
-            </w:pPr>
-            <w:r>
-              <w:t xml:space="preserve">8</w:t>
-            </w:r>
-          </w:p>
-        </w:tc>
-        <w:tc>
-          <w:tcPr/>
-          <w:p>
-            <w:pPr>
-              <w:pStyle w:val="Compact"/>
-              <w:jc w:val="left"/>
-            </w:pPr>
-            <w:r>
-              <w:t xml:space="preserve">Timer (telefon)</w:t>
-            </w:r>
-          </w:p>
-        </w:tc>
-        <w:tc>
-          <w:tcPr/>
-          <w:p>
-            <w:pPr>
-              <w:pStyle w:val="Compact"/>
-              <w:jc w:val="left"/>
-            </w:pPr>
-            <w:r>
-              <w:t xml:space="preserve">90 sek liikumine</w:t>
+              <w:t xml:space="preserve">Maapähklid, mõtteviis</w:t>
             </w:r>
           </w:p>
         </w:tc>
       </w:tr>
     </w:tbl>
-    <w:p>
-      <w:r>
-        <w:pict>
-          <v:rect style="width:0;height:1.5pt" o:hralign="center" o:hrstd="t" o:hr="t"/>
-        </w:pict>
-      </w:r>
-    </w:p>
-    <w:bookmarkEnd w:id="39"/>
-    <w:bookmarkStart w:id="40" w:name="groq-grok-imagine-valikuline-avamine"/>
-    <w:p>
-      <w:pPr>
-        <w:pStyle w:val="Heading2"/>
-      </w:pPr>
-      <w:r>
-        <w:t xml:space="preserve">7. GROQ / GROK IMAGINE (valikuline avamine)</w:t>
-      </w:r>
-    </w:p>
-    <w:p>
-      <w:pPr>
-        <w:pStyle w:val="FirstParagraph"/>
-      </w:pPr>
-      <w:r>
-        <w:t xml:space="preserve">Kui ruumis on ekraan, näita pilti või lase osalejatel genereerida:</w:t>
-      </w:r>
-    </w:p>
-    <w:p>
-      <w:pPr>
-        <w:pStyle w:val="BlockText"/>
-      </w:pPr>
-      <w:r>
-        <w:rPr>
-          <w:iCs/>
-          <w:i/>
-        </w:rPr>
-        <w:t xml:space="preserve">Eesti pere metsa servas ja kogukonnaõues — naermas, kütmine, lapsed paljajalu, seened õppeks, joogikraan.</w:t>
-      </w:r>
-    </w:p>
-    <w:p>
-      <w:pPr>
-        <w:pStyle w:val="FirstParagraph"/>
-      </w:pPr>
-      <w:r>
-        <w:t xml:space="preserve">Täielik prompt: Lisa BI või Lisa BJ lõpus.</w:t>
-      </w:r>
-    </w:p>
     <w:p>
       <w:r>
         <w:pict>
@@ -3822,8 +2388,8 @@
         <w:t xml:space="preserve">KK1 — Inimlik tuum. Operatsioon „Peegel”. Avalik — koolitajale ja demomeestele.</w:t>
       </w:r>
     </w:p>
-    <w:bookmarkEnd w:id="40"/>
-    <w:bookmarkEnd w:id="41"/>
+    <w:bookmarkEnd w:id="26"/>
+    <w:bookmarkEnd w:id="27"/>
     <w:sectPr>
       <w:pgSz w:h="15840" w:w="12240"/>
       <w:pgMar w:bottom="1417" w:footer="720" w:gutter="0" w:header="720" w:left="1417" w:right="1417" w:top="1417"/>
@@ -4106,91 +2672,6 @@
       </w:pPr>
     </w:lvl>
   </w:abstractNum>
-  <w:abstractNum w:abstractNumId="99411">
-    <w:nsid w:val="A99411"/>
-    <w:multiLevelType w:val="multilevel"/>
-    <w:lvl w:ilvl="0">
-      <w:start w:val="1"/>
-      <w:numFmt w:val="decimal"/>
-      <w:lvlText w:val="%1."/>
-      <w:lvlJc w:val="left"/>
-      <w:pPr>
-        <w:ind w:left="720" w:hanging="480"/>
-      </w:pPr>
-    </w:lvl>
-    <w:lvl w:ilvl="1">
-      <w:start w:val="1"/>
-      <w:numFmt w:val="decimal"/>
-      <w:lvlText w:val="%2."/>
-      <w:lvlJc w:val="left"/>
-      <w:pPr>
-        <w:ind w:left="1440" w:hanging="480"/>
-      </w:pPr>
-    </w:lvl>
-    <w:lvl w:ilvl="2">
-      <w:start w:val="1"/>
-      <w:numFmt w:val="decimal"/>
-      <w:lvlText w:val="%3."/>
-      <w:lvlJc w:val="left"/>
-      <w:pPr>
-        <w:ind w:left="2160" w:hanging="480"/>
-      </w:pPr>
-    </w:lvl>
-    <w:lvl w:ilvl="3">
-      <w:start w:val="1"/>
-      <w:numFmt w:val="decimal"/>
-      <w:lvlText w:val="%4."/>
-      <w:lvlJc w:val="left"/>
-      <w:pPr>
-        <w:ind w:left="2880" w:hanging="480"/>
-      </w:pPr>
-    </w:lvl>
-    <w:lvl w:ilvl="4">
-      <w:start w:val="1"/>
-      <w:numFmt w:val="decimal"/>
-      <w:lvlText w:val="%5."/>
-      <w:lvlJc w:val="left"/>
-      <w:pPr>
-        <w:ind w:left="3600" w:hanging="480"/>
-      </w:pPr>
-    </w:lvl>
-    <w:lvl w:ilvl="5">
-      <w:start w:val="1"/>
-      <w:numFmt w:val="decimal"/>
-      <w:lvlText w:val="%6."/>
-      <w:lvlJc w:val="left"/>
-      <w:pPr>
-        <w:ind w:left="4320" w:hanging="480"/>
-      </w:pPr>
-    </w:lvl>
-    <w:lvl w:ilvl="6">
-      <w:start w:val="1"/>
-      <w:numFmt w:val="decimal"/>
-      <w:lvlText w:val="%7."/>
-      <w:lvlJc w:val="left"/>
-      <w:pPr>
-        <w:ind w:left="5040" w:hanging="480"/>
-      </w:pPr>
-    </w:lvl>
-    <w:lvl w:ilvl="7">
-      <w:start w:val="1"/>
-      <w:numFmt w:val="decimal"/>
-      <w:lvlText w:val="%8."/>
-      <w:lvlJc w:val="left"/>
-      <w:pPr>
-        <w:ind w:left="5760" w:hanging="480"/>
-      </w:pPr>
-    </w:lvl>
-    <w:lvl w:ilvl="8">
-      <w:start w:val="1"/>
-      <w:numFmt w:val="decimal"/>
-      <w:lvlText w:val="%9."/>
-      <w:lvlJc w:val="left"/>
-      <w:pPr>
-        <w:ind w:left="6480" w:hanging="480"/>
-      </w:pPr>
-    </w:lvl>
-  </w:abstractNum>
   <w:num w:numId="1">
     <w:abstractNumId w:val="8"/>
   </w:num>
@@ -4220,66 +2701,6 @@
   </w:num>
   <w:num w:numId="1000">
     <w:abstractNumId w:val="990"/>
-  </w:num>
-  <w:num w:numId="1001">
-    <w:abstractNumId w:val="99411"/>
-    <w:lvlOverride w:ilvl="0">
-      <w:startOverride w:val="1"/>
-    </w:lvlOverride>
-    <w:lvlOverride w:ilvl="1">
-      <w:startOverride w:val="1"/>
-    </w:lvlOverride>
-    <w:lvlOverride w:ilvl="2">
-      <w:startOverride w:val="1"/>
-    </w:lvlOverride>
-    <w:lvlOverride w:ilvl="3">
-      <w:startOverride w:val="1"/>
-    </w:lvlOverride>
-    <w:lvlOverride w:ilvl="4">
-      <w:startOverride w:val="1"/>
-    </w:lvlOverride>
-    <w:lvlOverride w:ilvl="5">
-      <w:startOverride w:val="1"/>
-    </w:lvlOverride>
-    <w:lvlOverride w:ilvl="6">
-      <w:startOverride w:val="1"/>
-    </w:lvlOverride>
-    <w:lvlOverride w:ilvl="7">
-      <w:startOverride w:val="1"/>
-    </w:lvlOverride>
-    <w:lvlOverride w:ilvl="8">
-      <w:startOverride w:val="1"/>
-    </w:lvlOverride>
-  </w:num>
-  <w:num w:numId="1002">
-    <w:abstractNumId w:val="99411"/>
-    <w:lvlOverride w:ilvl="0">
-      <w:startOverride w:val="1"/>
-    </w:lvlOverride>
-    <w:lvlOverride w:ilvl="1">
-      <w:startOverride w:val="1"/>
-    </w:lvlOverride>
-    <w:lvlOverride w:ilvl="2">
-      <w:startOverride w:val="1"/>
-    </w:lvlOverride>
-    <w:lvlOverride w:ilvl="3">
-      <w:startOverride w:val="1"/>
-    </w:lvlOverride>
-    <w:lvlOverride w:ilvl="4">
-      <w:startOverride w:val="1"/>
-    </w:lvlOverride>
-    <w:lvlOverride w:ilvl="5">
-      <w:startOverride w:val="1"/>
-    </w:lvlOverride>
-    <w:lvlOverride w:ilvl="6">
-      <w:startOverride w:val="1"/>
-    </w:lvlOverride>
-    <w:lvlOverride w:ilvl="7">
-      <w:startOverride w:val="1"/>
-    </w:lvlOverride>
-    <w:lvlOverride w:ilvl="8">
-      <w:startOverride w:val="1"/>
-    </w:lvlOverride>
   </w:num>
 </w:numbering>
 </file>

</xml_diff>